<commit_message>
docs: Reorder roadmap phases for enterprise scalability
</commit_message>
<xml_diff>
--- a/ENTERPRISE_TASKLIST.docx
+++ b/ENTERPRISE_TASKLIST.docx
@@ -1801,13 +1801,1152 @@
       </w:r>
     </w:p>
     <w:bookmarkEnd w:id="11"/>
-    <w:bookmarkStart w:id="12" w:name="X5fd2ef1af899a9f6c517f47e4852ad978911dcd"/>
+    <w:bookmarkStart w:id="12" w:name="X7f8ddd9060f967a1a0a1a188f831a17d1dbcd7d"/>
     <w:p>
       <w:pPr>
         <w:pStyle w:val="Heading2"/>
       </w:pPr>
       <w:r>
-        <w:t xml:space="preserve">Phase 4: Authentication &amp; Authorization (Tasks 18–25)</w:t>
+        <w:t xml:space="preserve">Phase 4: Storage, Data Lifecycle &amp; Distributed Scale (Tasks 35–40)</w:t>
+      </w:r>
+    </w:p>
+    <w:p>
+      <w:pPr>
+        <w:pStyle w:val="FirstParagraph"/>
+      </w:pPr>
+      <w:r>
+        <w:rPr>
+          <w:i/>
+          <w:iCs/>
+        </w:rPr>
+        <w:t xml:space="preserve">Goal: Handle petabyte-scale log volumes — closing the infrastructure gap vs Splunk.</w:t>
+      </w:r>
+    </w:p>
+    <w:tbl>
+      <w:tblPr>
+        <w:tblStyle w:val="Table"/>
+        <w:tblW w:type="pct" w:w="5000"/>
+        <w:tblLayout w:type="fixed"/>
+        <w:tblLook w:firstRow="1" w:lastRow="0" w:firstColumn="0" w:lastColumn="0" w:noHBand="0" w:noVBand="0" w:val="0020"/>
+      </w:tblPr>
+      <w:tblGrid>
+        <w:gridCol w:w="625"/>
+        <w:gridCol w:w="1250"/>
+        <w:gridCol w:w="2709"/>
+        <w:gridCol w:w="3334"/>
+      </w:tblGrid>
+      <w:tr>
+        <w:trPr>
+          <w:tblHeader w:val="on"/>
+        </w:trPr>
+        <w:tc>
+          <w:tcPr/>
+          <w:p>
+            <w:pPr>
+              <w:pStyle w:val="Compact"/>
+            </w:pPr>
+            <w:r>
+              <w:t xml:space="preserve">#</w:t>
+            </w:r>
+          </w:p>
+        </w:tc>
+        <w:tc>
+          <w:tcPr/>
+          <w:p>
+            <w:pPr>
+              <w:pStyle w:val="Compact"/>
+            </w:pPr>
+            <w:r>
+              <w:t xml:space="preserve">Task</w:t>
+            </w:r>
+          </w:p>
+        </w:tc>
+        <w:tc>
+          <w:tcPr/>
+          <w:p>
+            <w:pPr>
+              <w:pStyle w:val="Compact"/>
+            </w:pPr>
+            <w:r>
+              <w:t xml:space="preserve">Description</w:t>
+            </w:r>
+          </w:p>
+        </w:tc>
+        <w:tc>
+          <w:tcPr/>
+          <w:p>
+            <w:pPr>
+              <w:pStyle w:val="Compact"/>
+            </w:pPr>
+            <w:r>
+              <w:t xml:space="preserve">Files Affected</w:t>
+            </w:r>
+          </w:p>
+        </w:tc>
+      </w:tr>
+      <w:tr>
+        <w:tc>
+          <w:tcPr/>
+          <w:p>
+            <w:pPr>
+              <w:pStyle w:val="Compact"/>
+            </w:pPr>
+            <w:r>
+              <w:t xml:space="preserve">35</w:t>
+            </w:r>
+          </w:p>
+        </w:tc>
+        <w:tc>
+          <w:tcPr/>
+          <w:p>
+            <w:pPr>
+              <w:pStyle w:val="Compact"/>
+            </w:pPr>
+            <w:r>
+              <w:rPr>
+                <w:b/>
+                <w:bCs/>
+              </w:rPr>
+              <w:t xml:space="preserve">S3/MinIO object storage</w:t>
+            </w:r>
+          </w:p>
+        </w:tc>
+        <w:tc>
+          <w:tcPr/>
+          <w:p>
+            <w:pPr>
+              <w:pStyle w:val="Compact"/>
+            </w:pPr>
+            <w:r>
+              <w:t xml:space="preserve">Replace local</w:t>
+            </w:r>
+            <w:r>
+              <w:t xml:space="preserve"> </w:t>
+            </w:r>
+            <w:r>
+              <w:rPr>
+                <w:rStyle w:val="VerbatimChar"/>
+              </w:rPr>
+              <w:t xml:space="preserve">data/</w:t>
+            </w:r>
+            <w:r>
+              <w:t xml:space="preserve"> </w:t>
+            </w:r>
+            <w:r>
+              <w:t xml:space="preserve">with S3-compatible object store.</w:t>
+            </w:r>
+            <w:r>
+              <w:t xml:space="preserve"> </w:t>
+            </w:r>
+            <w:r>
+              <w:rPr>
+                <w:rStyle w:val="VerbatimChar"/>
+              </w:rPr>
+              <w:t xml:space="preserve">boto3</w:t>
+            </w:r>
+            <w:r>
+              <w:t xml:space="preserve"> </w:t>
+            </w:r>
+            <w:r>
+              <w:t xml:space="preserve">for AWS,</w:t>
+            </w:r>
+            <w:r>
+              <w:t xml:space="preserve"> </w:t>
+            </w:r>
+            <w:r>
+              <w:rPr>
+                <w:rStyle w:val="VerbatimChar"/>
+              </w:rPr>
+              <w:t xml:space="preserve">minio</w:t>
+            </w:r>
+            <w:r>
+              <w:t xml:space="preserve"> </w:t>
+            </w:r>
+            <w:r>
+              <w:t xml:space="preserve">client for self-hosted. Infinite scale at $0.023/GB/month.</w:t>
+            </w:r>
+          </w:p>
+        </w:tc>
+        <w:tc>
+          <w:tcPr/>
+          <w:p>
+            <w:pPr>
+              <w:pStyle w:val="Compact"/>
+            </w:pPr>
+            <w:r>
+              <w:t xml:space="preserve">New:</w:t>
+            </w:r>
+            <w:r>
+              <w:t xml:space="preserve"> </w:t>
+            </w:r>
+            <w:r>
+              <w:rPr>
+                <w:rStyle w:val="VerbatimChar"/>
+              </w:rPr>
+              <w:t xml:space="preserve">storage/object_store.py</w:t>
+            </w:r>
+            <w:r>
+              <w:t xml:space="preserve">,</w:t>
+            </w:r>
+            <w:r>
+              <w:t xml:space="preserve"> </w:t>
+            </w:r>
+            <w:r>
+              <w:rPr>
+                <w:rStyle w:val="VerbatimChar"/>
+              </w:rPr>
+              <w:t xml:space="preserve">api/main.py</w:t>
+            </w:r>
+          </w:p>
+        </w:tc>
+      </w:tr>
+      <w:tr>
+        <w:tc>
+          <w:tcPr/>
+          <w:p>
+            <w:pPr>
+              <w:pStyle w:val="Compact"/>
+            </w:pPr>
+            <w:r>
+              <w:t xml:space="preserve">36</w:t>
+            </w:r>
+          </w:p>
+        </w:tc>
+        <w:tc>
+          <w:tcPr/>
+          <w:p>
+            <w:pPr>
+              <w:pStyle w:val="Compact"/>
+            </w:pPr>
+            <w:r>
+              <w:rPr>
+                <w:b/>
+                <w:bCs/>
+              </w:rPr>
+              <w:t xml:space="preserve">Wire S3 into retention scheduler</w:t>
+            </w:r>
+          </w:p>
+        </w:tc>
+        <w:tc>
+          <w:tcPr/>
+          <w:p>
+            <w:pPr>
+              <w:pStyle w:val="Compact"/>
+            </w:pPr>
+            <w:r>
+              <w:t xml:space="preserve">Compress logs older than 7 days → upload to S3 → delete local. Add Storage section to Settings page.</w:t>
+            </w:r>
+          </w:p>
+        </w:tc>
+        <w:tc>
+          <w:tcPr/>
+          <w:p>
+            <w:pPr>
+              <w:pStyle w:val="Compact"/>
+            </w:pPr>
+            <w:r>
+              <w:rPr>
+                <w:rStyle w:val="VerbatimChar"/>
+              </w:rPr>
+              <w:t xml:space="preserve">api/scheduler.py</w:t>
+            </w:r>
+            <w:r>
+              <w:t xml:space="preserve">,</w:t>
+            </w:r>
+            <w:r>
+              <w:t xml:space="preserve"> </w:t>
+            </w:r>
+            <w:r>
+              <w:rPr>
+                <w:rStyle w:val="VerbatimChar"/>
+              </w:rPr>
+              <w:t xml:space="preserve">web/src/app/app/settings/page.tsx</w:t>
+            </w:r>
+          </w:p>
+        </w:tc>
+      </w:tr>
+      <w:tr>
+        <w:tc>
+          <w:tcPr/>
+          <w:p>
+            <w:pPr>
+              <w:pStyle w:val="Compact"/>
+            </w:pPr>
+            <w:r>
+              <w:t xml:space="preserve">37</w:t>
+            </w:r>
+          </w:p>
+        </w:tc>
+        <w:tc>
+          <w:tcPr/>
+          <w:p>
+            <w:pPr>
+              <w:pStyle w:val="Compact"/>
+            </w:pPr>
+            <w:r>
+              <w:rPr>
+                <w:b/>
+                <w:bCs/>
+              </w:rPr>
+              <w:t xml:space="preserve">Log file rotation</w:t>
+            </w:r>
+          </w:p>
+        </w:tc>
+        <w:tc>
+          <w:tcPr/>
+          <w:p>
+            <w:pPr>
+              <w:pStyle w:val="Compact"/>
+            </w:pPr>
+            <w:r>
+              <w:t xml:space="preserve">Auto-rotate</w:t>
+            </w:r>
+            <w:r>
+              <w:t xml:space="preserve"> </w:t>
+            </w:r>
+            <w:r>
+              <w:rPr>
+                <w:rStyle w:val="VerbatimChar"/>
+              </w:rPr>
+              <w:t xml:space="preserve">live_stream.log</w:t>
+            </w:r>
+            <w:r>
+              <w:t xml:space="preserve"> </w:t>
+            </w:r>
+            <w:r>
+              <w:t xml:space="preserve">at 100MB. Rename to</w:t>
+            </w:r>
+            <w:r>
+              <w:t xml:space="preserve"> </w:t>
+            </w:r>
+            <w:r>
+              <w:rPr>
+                <w:rStyle w:val="VerbatimChar"/>
+              </w:rPr>
+              <w:t xml:space="preserve">live_stream_&lt;timestamp&gt;.log</w:t>
+            </w:r>
+            <w:r>
+              <w:t xml:space="preserve">, create fresh file. Old files archived by S3.</w:t>
+            </w:r>
+          </w:p>
+        </w:tc>
+        <w:tc>
+          <w:tcPr/>
+          <w:p>
+            <w:pPr>
+              <w:pStyle w:val="Compact"/>
+            </w:pPr>
+            <w:r>
+              <w:rPr>
+                <w:rStyle w:val="VerbatimChar"/>
+              </w:rPr>
+              <w:t xml:space="preserve">api/main.py</w:t>
+            </w:r>
+          </w:p>
+        </w:tc>
+      </w:tr>
+      <w:tr>
+        <w:tc>
+          <w:tcPr/>
+          <w:p>
+            <w:pPr>
+              <w:pStyle w:val="Compact"/>
+            </w:pPr>
+            <w:r>
+              <w:t xml:space="preserve">38</w:t>
+            </w:r>
+          </w:p>
+        </w:tc>
+        <w:tc>
+          <w:tcPr/>
+          <w:p>
+            <w:pPr>
+              <w:pStyle w:val="Compact"/>
+            </w:pPr>
+            <w:r>
+              <w:rPr>
+                <w:b/>
+                <w:bCs/>
+              </w:rPr>
+              <w:t xml:space="preserve">Persistent vector database (LanceDB)</w:t>
+            </w:r>
+          </w:p>
+        </w:tc>
+        <w:tc>
+          <w:tcPr/>
+          <w:p>
+            <w:pPr>
+              <w:pStyle w:val="Compact"/>
+            </w:pPr>
+            <w:r>
+              <w:t xml:space="preserve">Store all embeddings persistently instead of discarding after analysis. Enables semantic search across all historical logs.</w:t>
+            </w:r>
+          </w:p>
+        </w:tc>
+        <w:tc>
+          <w:tcPr/>
+          <w:p>
+            <w:pPr>
+              <w:pStyle w:val="Compact"/>
+            </w:pPr>
+            <w:r>
+              <w:t xml:space="preserve">New:</w:t>
+            </w:r>
+            <w:r>
+              <w:t xml:space="preserve"> </w:t>
+            </w:r>
+            <w:r>
+              <w:rPr>
+                <w:rStyle w:val="VerbatimChar"/>
+              </w:rPr>
+              <w:t xml:space="preserve">storage/vector_store.py</w:t>
+            </w:r>
+            <w:r>
+              <w:t xml:space="preserve">, modify clustering pipeline</w:t>
+            </w:r>
+          </w:p>
+        </w:tc>
+      </w:tr>
+      <w:tr>
+        <w:tc>
+          <w:tcPr/>
+          <w:p>
+            <w:pPr>
+              <w:pStyle w:val="Compact"/>
+            </w:pPr>
+            <w:r>
+              <w:t xml:space="preserve">39</w:t>
+            </w:r>
+          </w:p>
+        </w:tc>
+        <w:tc>
+          <w:tcPr/>
+          <w:p>
+            <w:pPr>
+              <w:pStyle w:val="Compact"/>
+            </w:pPr>
+            <w:r>
+              <w:rPr>
+                <w:b/>
+                <w:bCs/>
+              </w:rPr>
+              <w:t xml:space="preserve">Redis/Celery async job queue</w:t>
+            </w:r>
+          </w:p>
+        </w:tc>
+        <w:tc>
+          <w:tcPr/>
+          <w:p>
+            <w:pPr>
+              <w:pStyle w:val="Compact"/>
+            </w:pPr>
+            <w:r>
+              <w:t xml:space="preserve">Replace synchronous</w:t>
+            </w:r>
+            <w:r>
+              <w:t xml:space="preserve"> </w:t>
+            </w:r>
+            <w:r>
+              <w:rPr>
+                <w:rStyle w:val="VerbatimChar"/>
+              </w:rPr>
+              <w:t xml:space="preserve">/analyze</w:t>
+            </w:r>
+            <w:r>
+              <w:t xml:space="preserve"> </w:t>
+            </w:r>
+            <w:r>
+              <w:t xml:space="preserve">with async jobs. API submits to Redis, workers process independently. Horizontal scaling.</w:t>
+            </w:r>
+          </w:p>
+        </w:tc>
+        <w:tc>
+          <w:tcPr/>
+          <w:p>
+            <w:pPr>
+              <w:pStyle w:val="Compact"/>
+            </w:pPr>
+            <w:r>
+              <w:t xml:space="preserve">New:</w:t>
+            </w:r>
+            <w:r>
+              <w:t xml:space="preserve"> </w:t>
+            </w:r>
+            <w:r>
+              <w:rPr>
+                <w:rStyle w:val="VerbatimChar"/>
+              </w:rPr>
+              <w:t xml:space="preserve">workers/analysis_worker.py</w:t>
+            </w:r>
+            <w:r>
+              <w:t xml:space="preserve">,</w:t>
+            </w:r>
+            <w:r>
+              <w:t xml:space="preserve"> </w:t>
+            </w:r>
+            <w:r>
+              <w:rPr>
+                <w:rStyle w:val="VerbatimChar"/>
+              </w:rPr>
+              <w:t xml:space="preserve">api/main.py</w:t>
+            </w:r>
+            <w:r>
+              <w:t xml:space="preserve">,</w:t>
+            </w:r>
+            <w:r>
+              <w:t xml:space="preserve"> </w:t>
+            </w:r>
+            <w:r>
+              <w:rPr>
+                <w:rStyle w:val="VerbatimChar"/>
+              </w:rPr>
+              <w:t xml:space="preserve">pyproject.toml</w:t>
+            </w:r>
+          </w:p>
+        </w:tc>
+      </w:tr>
+      <w:tr>
+        <w:tc>
+          <w:tcPr/>
+          <w:p>
+            <w:pPr>
+              <w:pStyle w:val="Compact"/>
+            </w:pPr>
+            <w:r>
+              <w:t xml:space="preserve">40</w:t>
+            </w:r>
+          </w:p>
+        </w:tc>
+        <w:tc>
+          <w:tcPr/>
+          <w:p>
+            <w:pPr>
+              <w:pStyle w:val="Compact"/>
+            </w:pPr>
+            <w:r>
+              <w:rPr>
+                <w:b/>
+                <w:bCs/>
+              </w:rPr>
+              <w:t xml:space="preserve">ClickHouse integration (advanced)</w:t>
+            </w:r>
+          </w:p>
+        </w:tc>
+        <w:tc>
+          <w:tcPr/>
+          <w:p>
+            <w:pPr>
+              <w:pStyle w:val="Compact"/>
+            </w:pPr>
+            <w:r>
+              <w:t xml:space="preserve">Columnar analytics DB for billion-row SQL queries in seconds. All ingested logs dual-written to ClickHouse. Replaces Splunk’s search.</w:t>
+            </w:r>
+          </w:p>
+        </w:tc>
+        <w:tc>
+          <w:tcPr/>
+          <w:p>
+            <w:pPr>
+              <w:pStyle w:val="Compact"/>
+            </w:pPr>
+            <w:r>
+              <w:t xml:space="preserve">New:</w:t>
+            </w:r>
+            <w:r>
+              <w:t xml:space="preserve"> </w:t>
+            </w:r>
+            <w:r>
+              <w:rPr>
+                <w:rStyle w:val="VerbatimChar"/>
+              </w:rPr>
+              <w:t xml:space="preserve">storage/clickhouse_store.py</w:t>
+            </w:r>
+            <w:r>
+              <w:t xml:space="preserve">,</w:t>
+            </w:r>
+            <w:r>
+              <w:t xml:space="preserve"> </w:t>
+            </w:r>
+            <w:r>
+              <w:rPr>
+                <w:rStyle w:val="VerbatimChar"/>
+              </w:rPr>
+              <w:t xml:space="preserve">pyproject.toml</w:t>
+            </w:r>
+          </w:p>
+        </w:tc>
+      </w:tr>
+    </w:tbl>
+    <w:p>
+      <w:r>
+        <w:pict>
+          <v:rect style="width:0;height:1.5pt" o:hralign="center" o:hrstd="t" o:hr="t"/>
+        </w:pict>
+      </w:r>
+    </w:p>
+    <w:bookmarkEnd w:id="12"/>
+    <w:bookmarkStart w:id="13" w:name="X6b00d1ebcc17e25a4c1b399dc4c63085c122264"/>
+    <w:p>
+      <w:pPr>
+        <w:pStyle w:val="Heading2"/>
+      </w:pPr>
+      <w:r>
+        <w:t xml:space="preserve">Phase 5: Containerization &amp; Deployment (Tasks 41–45)</w:t>
+      </w:r>
+    </w:p>
+    <w:p>
+      <w:pPr>
+        <w:pStyle w:val="FirstParagraph"/>
+      </w:pPr>
+      <w:r>
+        <w:rPr>
+          <w:i/>
+          <w:iCs/>
+        </w:rPr>
+        <w:t xml:space="preserve">Goal: Deployable anywhere with a single command.</w:t>
+      </w:r>
+    </w:p>
+    <w:tbl>
+      <w:tblPr>
+        <w:tblStyle w:val="Table"/>
+        <w:tblW w:type="pct" w:w="5000"/>
+        <w:tblLayout w:type="fixed"/>
+        <w:tblLook w:firstRow="1" w:lastRow="0" w:firstColumn="0" w:lastColumn="0" w:noHBand="0" w:noVBand="0" w:val="0020"/>
+      </w:tblPr>
+      <w:tblGrid>
+        <w:gridCol w:w="625"/>
+        <w:gridCol w:w="1250"/>
+        <w:gridCol w:w="2709"/>
+        <w:gridCol w:w="3334"/>
+      </w:tblGrid>
+      <w:tr>
+        <w:trPr>
+          <w:tblHeader w:val="on"/>
+        </w:trPr>
+        <w:tc>
+          <w:tcPr/>
+          <w:p>
+            <w:pPr>
+              <w:pStyle w:val="Compact"/>
+            </w:pPr>
+            <w:r>
+              <w:t xml:space="preserve">#</w:t>
+            </w:r>
+          </w:p>
+        </w:tc>
+        <w:tc>
+          <w:tcPr/>
+          <w:p>
+            <w:pPr>
+              <w:pStyle w:val="Compact"/>
+            </w:pPr>
+            <w:r>
+              <w:t xml:space="preserve">Task</w:t>
+            </w:r>
+          </w:p>
+        </w:tc>
+        <w:tc>
+          <w:tcPr/>
+          <w:p>
+            <w:pPr>
+              <w:pStyle w:val="Compact"/>
+            </w:pPr>
+            <w:r>
+              <w:t xml:space="preserve">Description</w:t>
+            </w:r>
+          </w:p>
+        </w:tc>
+        <w:tc>
+          <w:tcPr/>
+          <w:p>
+            <w:pPr>
+              <w:pStyle w:val="Compact"/>
+            </w:pPr>
+            <w:r>
+              <w:t xml:space="preserve">Files Affected</w:t>
+            </w:r>
+          </w:p>
+        </w:tc>
+      </w:tr>
+      <w:tr>
+        <w:tc>
+          <w:tcPr/>
+          <w:p>
+            <w:pPr>
+              <w:pStyle w:val="Compact"/>
+            </w:pPr>
+            <w:r>
+              <w:t xml:space="preserve">41</w:t>
+            </w:r>
+          </w:p>
+        </w:tc>
+        <w:tc>
+          <w:tcPr/>
+          <w:p>
+            <w:pPr>
+              <w:pStyle w:val="Compact"/>
+            </w:pPr>
+            <w:r>
+              <w:rPr>
+                <w:b/>
+                <w:bCs/>
+              </w:rPr>
+              <w:t xml:space="preserve">Backend Dockerfile</w:t>
+            </w:r>
+          </w:p>
+        </w:tc>
+        <w:tc>
+          <w:tcPr/>
+          <w:p>
+            <w:pPr>
+              <w:pStyle w:val="Compact"/>
+            </w:pPr>
+            <w:r>
+              <w:t xml:space="preserve">Multi-stage: build deps with</w:t>
+            </w:r>
+            <w:r>
+              <w:t xml:space="preserve"> </w:t>
+            </w:r>
+            <w:r>
+              <w:rPr>
+                <w:rStyle w:val="VerbatimChar"/>
+              </w:rPr>
+              <w:t xml:space="preserve">uv</w:t>
+            </w:r>
+            <w:r>
+              <w:t xml:space="preserve">, copy to slim image.</w:t>
+            </w:r>
+            <w:r>
+              <w:t xml:space="preserve"> </w:t>
+            </w:r>
+            <w:r>
+              <w:rPr>
+                <w:rStyle w:val="VerbatimChar"/>
+              </w:rPr>
+              <w:t xml:space="preserve">gunicorn</w:t>
+            </w:r>
+            <w:r>
+              <w:t xml:space="preserve"> </w:t>
+            </w:r>
+            <w:r>
+              <w:t xml:space="preserve">+</w:t>
+            </w:r>
+            <w:r>
+              <w:t xml:space="preserve"> </w:t>
+            </w:r>
+            <w:r>
+              <w:rPr>
+                <w:rStyle w:val="VerbatimChar"/>
+              </w:rPr>
+              <w:t xml:space="preserve">uvicorn</w:t>
+            </w:r>
+            <w:r>
+              <w:t xml:space="preserve"> </w:t>
+            </w:r>
+            <w:r>
+              <w:t xml:space="preserve">workers. Port 8000.</w:t>
+            </w:r>
+          </w:p>
+        </w:tc>
+        <w:tc>
+          <w:tcPr/>
+          <w:p>
+            <w:pPr>
+              <w:pStyle w:val="Compact"/>
+            </w:pPr>
+            <w:r>
+              <w:t xml:space="preserve">New:</w:t>
+            </w:r>
+            <w:r>
+              <w:t xml:space="preserve"> </w:t>
+            </w:r>
+            <w:r>
+              <w:rPr>
+                <w:rStyle w:val="VerbatimChar"/>
+              </w:rPr>
+              <w:t xml:space="preserve">Dockerfile</w:t>
+            </w:r>
+          </w:p>
+        </w:tc>
+      </w:tr>
+      <w:tr>
+        <w:tc>
+          <w:tcPr/>
+          <w:p>
+            <w:pPr>
+              <w:pStyle w:val="Compact"/>
+            </w:pPr>
+            <w:r>
+              <w:t xml:space="preserve">42</w:t>
+            </w:r>
+          </w:p>
+        </w:tc>
+        <w:tc>
+          <w:tcPr/>
+          <w:p>
+            <w:pPr>
+              <w:pStyle w:val="Compact"/>
+            </w:pPr>
+            <w:r>
+              <w:rPr>
+                <w:b/>
+                <w:bCs/>
+              </w:rPr>
+              <w:t xml:space="preserve">Frontend Dockerfile</w:t>
+            </w:r>
+          </w:p>
+        </w:tc>
+        <w:tc>
+          <w:tcPr/>
+          <w:p>
+            <w:pPr>
+              <w:pStyle w:val="Compact"/>
+            </w:pPr>
+            <w:r>
+              <w:t xml:space="preserve">Multi-stage:</w:t>
+            </w:r>
+            <w:r>
+              <w:t xml:space="preserve"> </w:t>
+            </w:r>
+            <w:r>
+              <w:rPr>
+                <w:rStyle w:val="VerbatimChar"/>
+              </w:rPr>
+              <w:t xml:space="preserve">npm run build</w:t>
+            </w:r>
+            <w:r>
+              <w:t xml:space="preserve"> </w:t>
+            </w:r>
+            <w:r>
+              <w:t xml:space="preserve">→</w:t>
+            </w:r>
+            <w:r>
+              <w:t xml:space="preserve"> </w:t>
+            </w:r>
+            <w:r>
+              <w:rPr>
+                <w:rStyle w:val="VerbatimChar"/>
+              </w:rPr>
+              <w:t xml:space="preserve">next start</w:t>
+            </w:r>
+            <w:r>
+              <w:t xml:space="preserve">. Port 3000.</w:t>
+            </w:r>
+          </w:p>
+        </w:tc>
+        <w:tc>
+          <w:tcPr/>
+          <w:p>
+            <w:pPr>
+              <w:pStyle w:val="Compact"/>
+            </w:pPr>
+            <w:r>
+              <w:t xml:space="preserve">New:</w:t>
+            </w:r>
+            <w:r>
+              <w:t xml:space="preserve"> </w:t>
+            </w:r>
+            <w:r>
+              <w:rPr>
+                <w:rStyle w:val="VerbatimChar"/>
+              </w:rPr>
+              <w:t xml:space="preserve">web/Dockerfile</w:t>
+            </w:r>
+          </w:p>
+        </w:tc>
+      </w:tr>
+      <w:tr>
+        <w:tc>
+          <w:tcPr/>
+          <w:p>
+            <w:pPr>
+              <w:pStyle w:val="Compact"/>
+            </w:pPr>
+            <w:r>
+              <w:t xml:space="preserve">43</w:t>
+            </w:r>
+          </w:p>
+        </w:tc>
+        <w:tc>
+          <w:tcPr/>
+          <w:p>
+            <w:pPr>
+              <w:pStyle w:val="Compact"/>
+            </w:pPr>
+            <w:r>
+              <w:rPr>
+                <w:b/>
+                <w:bCs/>
+              </w:rPr>
+              <w:t xml:space="preserve">docker-compose.yml</w:t>
+            </w:r>
+          </w:p>
+        </w:tc>
+        <w:tc>
+          <w:tcPr/>
+          <w:p>
+            <w:pPr>
+              <w:pStyle w:val="Compact"/>
+            </w:pPr>
+            <w:r>
+              <w:t xml:space="preserve">4 services:</w:t>
+            </w:r>
+            <w:r>
+              <w:t xml:space="preserve"> </w:t>
+            </w:r>
+            <w:r>
+              <w:rPr>
+                <w:rStyle w:val="VerbatimChar"/>
+              </w:rPr>
+              <w:t xml:space="preserve">api</w:t>
+            </w:r>
+            <w:r>
+              <w:t xml:space="preserve">,</w:t>
+            </w:r>
+            <w:r>
+              <w:t xml:space="preserve"> </w:t>
+            </w:r>
+            <w:r>
+              <w:rPr>
+                <w:rStyle w:val="VerbatimChar"/>
+              </w:rPr>
+              <w:t xml:space="preserve">web</w:t>
+            </w:r>
+            <w:r>
+              <w:t xml:space="preserve">,</w:t>
+            </w:r>
+            <w:r>
+              <w:t xml:space="preserve"> </w:t>
+            </w:r>
+            <w:r>
+              <w:rPr>
+                <w:rStyle w:val="VerbatimChar"/>
+              </w:rPr>
+              <w:t xml:space="preserve">db</w:t>
+            </w:r>
+            <w:r>
+              <w:t xml:space="preserve"> </w:t>
+            </w:r>
+            <w:r>
+              <w:t xml:space="preserve">(PostgreSQL),</w:t>
+            </w:r>
+            <w:r>
+              <w:t xml:space="preserve"> </w:t>
+            </w:r>
+            <w:r>
+              <w:rPr>
+                <w:rStyle w:val="VerbatimChar"/>
+              </w:rPr>
+              <w:t xml:space="preserve">redis</w:t>
+            </w:r>
+            <w:r>
+              <w:t xml:space="preserve">. Health checks, volumes, shared network.</w:t>
+            </w:r>
+          </w:p>
+        </w:tc>
+        <w:tc>
+          <w:tcPr/>
+          <w:p>
+            <w:pPr>
+              <w:pStyle w:val="Compact"/>
+            </w:pPr>
+            <w:r>
+              <w:t xml:space="preserve">New:</w:t>
+            </w:r>
+            <w:r>
+              <w:t xml:space="preserve"> </w:t>
+            </w:r>
+            <w:r>
+              <w:rPr>
+                <w:rStyle w:val="VerbatimChar"/>
+              </w:rPr>
+              <w:t xml:space="preserve">docker-compose.yml</w:t>
+            </w:r>
+          </w:p>
+        </w:tc>
+      </w:tr>
+      <w:tr>
+        <w:tc>
+          <w:tcPr/>
+          <w:p>
+            <w:pPr>
+              <w:pStyle w:val="Compact"/>
+            </w:pPr>
+            <w:r>
+              <w:t xml:space="preserve">44</w:t>
+            </w:r>
+          </w:p>
+        </w:tc>
+        <w:tc>
+          <w:tcPr/>
+          <w:p>
+            <w:pPr>
+              <w:pStyle w:val="Compact"/>
+            </w:pPr>
+            <w:r>
+              <w:rPr>
+                <w:b/>
+                <w:bCs/>
+              </w:rPr>
+              <w:t xml:space="preserve">HTTPS with Nginx reverse proxy</w:t>
+            </w:r>
+          </w:p>
+        </w:tc>
+        <w:tc>
+          <w:tcPr/>
+          <w:p>
+            <w:pPr>
+              <w:pStyle w:val="Compact"/>
+            </w:pPr>
+            <w:r>
+              <w:t xml:space="preserve">Add</w:t>
+            </w:r>
+            <w:r>
+              <w:t xml:space="preserve"> </w:t>
+            </w:r>
+            <w:r>
+              <w:rPr>
+                <w:rStyle w:val="VerbatimChar"/>
+              </w:rPr>
+              <w:t xml:space="preserve">nginx</w:t>
+            </w:r>
+            <w:r>
+              <w:t xml:space="preserve"> </w:t>
+            </w:r>
+            <w:r>
+              <w:t xml:space="preserve">service to compose. TLS termination. Self-signed certs for dev, real certs for prod.</w:t>
+            </w:r>
+          </w:p>
+        </w:tc>
+        <w:tc>
+          <w:tcPr/>
+          <w:p>
+            <w:pPr>
+              <w:pStyle w:val="Compact"/>
+            </w:pPr>
+            <w:r>
+              <w:t xml:space="preserve">New:</w:t>
+            </w:r>
+            <w:r>
+              <w:t xml:space="preserve"> </w:t>
+            </w:r>
+            <w:r>
+              <w:rPr>
+                <w:rStyle w:val="VerbatimChar"/>
+              </w:rPr>
+              <w:t xml:space="preserve">nginx/nginx.conf</w:t>
+            </w:r>
+            <w:r>
+              <w:t xml:space="preserve">,</w:t>
+            </w:r>
+            <w:r>
+              <w:t xml:space="preserve"> </w:t>
+            </w:r>
+            <w:r>
+              <w:rPr>
+                <w:rStyle w:val="VerbatimChar"/>
+              </w:rPr>
+              <w:t xml:space="preserve">docker-compose.yml</w:t>
+            </w:r>
+          </w:p>
+        </w:tc>
+      </w:tr>
+      <w:tr>
+        <w:tc>
+          <w:tcPr/>
+          <w:p>
+            <w:pPr>
+              <w:pStyle w:val="Compact"/>
+            </w:pPr>
+            <w:r>
+              <w:t xml:space="preserve">45</w:t>
+            </w:r>
+          </w:p>
+        </w:tc>
+        <w:tc>
+          <w:tcPr/>
+          <w:p>
+            <w:pPr>
+              <w:pStyle w:val="Compact"/>
+            </w:pPr>
+            <w:r>
+              <w:rPr>
+                <w:b/>
+                <w:bCs/>
+              </w:rPr>
+              <w:t xml:space="preserve">Redis pub/sub for WebSocket scaling</w:t>
+            </w:r>
+          </w:p>
+        </w:tc>
+        <w:tc>
+          <w:tcPr/>
+          <w:p>
+            <w:pPr>
+              <w:pStyle w:val="Compact"/>
+            </w:pPr>
+            <w:r>
+              <w:t xml:space="preserve">Replace in-process WebSocket with Redis pub/sub channel.</w:t>
+            </w:r>
+            <w:r>
+              <w:t xml:space="preserve"> </w:t>
+            </w:r>
+            <w:r>
+              <w:rPr>
+                <w:rStyle w:val="VerbatimChar"/>
+              </w:rPr>
+              <w:t xml:space="preserve">/ingest</w:t>
+            </w:r>
+            <w:r>
+              <w:t xml:space="preserve"> </w:t>
+            </w:r>
+            <w:r>
+              <w:t xml:space="preserve">publishes, all WS connections subscribe. Enables horizontal API scaling.</w:t>
+            </w:r>
+          </w:p>
+        </w:tc>
+        <w:tc>
+          <w:tcPr/>
+          <w:p>
+            <w:pPr>
+              <w:pStyle w:val="Compact"/>
+            </w:pPr>
+            <w:r>
+              <w:rPr>
+                <w:rStyle w:val="VerbatimChar"/>
+              </w:rPr>
+              <w:t xml:space="preserve">api/main.py</w:t>
+            </w:r>
+            <w:r>
+              <w:t xml:space="preserve">,</w:t>
+            </w:r>
+            <w:r>
+              <w:t xml:space="preserve"> </w:t>
+            </w:r>
+            <w:r>
+              <w:rPr>
+                <w:rStyle w:val="VerbatimChar"/>
+              </w:rPr>
+              <w:t xml:space="preserve">pyproject.toml</w:t>
+            </w:r>
+          </w:p>
+        </w:tc>
+      </w:tr>
+    </w:tbl>
+    <w:p>
+      <w:r>
+        <w:pict>
+          <v:rect style="width:0;height:1.5pt" o:hralign="center" o:hrstd="t" o:hr="t"/>
+        </w:pict>
+      </w:r>
+    </w:p>
+    <w:bookmarkEnd w:id="13"/>
+    <w:bookmarkStart w:id="14" w:name="Xc11121c7d990298c4f57e6989b886c9ae36580b"/>
+    <w:p>
+      <w:pPr>
+        <w:pStyle w:val="Heading2"/>
+      </w:pPr>
+      <w:r>
+        <w:t xml:space="preserve">Phase 6: Authentication &amp; Authorization (Tasks 18–25)</w:t>
       </w:r>
     </w:p>
     <w:p>
@@ -2715,14 +3854,916 @@
         </w:pict>
       </w:r>
     </w:p>
-    <w:bookmarkEnd w:id="12"/>
-    <w:bookmarkStart w:id="13" w:name="X2cad89c0e4b6190627069a3a712b44611603791"/>
+    <w:bookmarkEnd w:id="14"/>
+    <w:bookmarkStart w:id="15" w:name="X984693fcc4a987931f8deaff706c00d100ca225"/>
     <w:p>
       <w:pPr>
         <w:pStyle w:val="Heading2"/>
       </w:pPr>
       <w:r>
-        <w:t xml:space="preserve">Phase 5: Alerting &amp; Notifications (Tasks 26–30)</w:t>
+        <w:t xml:space="preserve">Phase 7: Audit Trail &amp; Compliance (Tasks 31–34)</w:t>
+      </w:r>
+    </w:p>
+    <w:p>
+      <w:pPr>
+        <w:pStyle w:val="FirstParagraph"/>
+      </w:pPr>
+      <w:r>
+        <w:rPr>
+          <w:i/>
+          <w:iCs/>
+        </w:rPr>
+        <w:t xml:space="preserve">Goal: Meet SOC2 and enterprise compliance requirements.</w:t>
+      </w:r>
+    </w:p>
+    <w:tbl>
+      <w:tblPr>
+        <w:tblStyle w:val="Table"/>
+        <w:tblW w:type="pct" w:w="5000"/>
+        <w:tblLayout w:type="fixed"/>
+        <w:tblLook w:firstRow="1" w:lastRow="0" w:firstColumn="0" w:lastColumn="0" w:noHBand="0" w:noVBand="0" w:val="0020"/>
+      </w:tblPr>
+      <w:tblGrid>
+        <w:gridCol w:w="625"/>
+        <w:gridCol w:w="1250"/>
+        <w:gridCol w:w="2709"/>
+        <w:gridCol w:w="3334"/>
+      </w:tblGrid>
+      <w:tr>
+        <w:trPr>
+          <w:tblHeader w:val="on"/>
+        </w:trPr>
+        <w:tc>
+          <w:tcPr/>
+          <w:p>
+            <w:pPr>
+              <w:pStyle w:val="Compact"/>
+            </w:pPr>
+            <w:r>
+              <w:t xml:space="preserve">#</w:t>
+            </w:r>
+          </w:p>
+        </w:tc>
+        <w:tc>
+          <w:tcPr/>
+          <w:p>
+            <w:pPr>
+              <w:pStyle w:val="Compact"/>
+            </w:pPr>
+            <w:r>
+              <w:t xml:space="preserve">Task</w:t>
+            </w:r>
+          </w:p>
+        </w:tc>
+        <w:tc>
+          <w:tcPr/>
+          <w:p>
+            <w:pPr>
+              <w:pStyle w:val="Compact"/>
+            </w:pPr>
+            <w:r>
+              <w:t xml:space="preserve">Description</w:t>
+            </w:r>
+          </w:p>
+        </w:tc>
+        <w:tc>
+          <w:tcPr/>
+          <w:p>
+            <w:pPr>
+              <w:pStyle w:val="Compact"/>
+            </w:pPr>
+            <w:r>
+              <w:t xml:space="preserve">Files Affected</w:t>
+            </w:r>
+          </w:p>
+        </w:tc>
+      </w:tr>
+      <w:tr>
+        <w:tc>
+          <w:tcPr/>
+          <w:p>
+            <w:pPr>
+              <w:pStyle w:val="Compact"/>
+            </w:pPr>
+            <w:r>
+              <w:t xml:space="preserve">31</w:t>
+            </w:r>
+          </w:p>
+        </w:tc>
+        <w:tc>
+          <w:tcPr/>
+          <w:p>
+            <w:pPr>
+              <w:pStyle w:val="Compact"/>
+            </w:pPr>
+            <w:r>
+              <w:rPr>
+                <w:b/>
+                <w:bCs/>
+              </w:rPr>
+              <w:t xml:space="preserve">AuditLog database model</w:t>
+            </w:r>
+          </w:p>
+        </w:tc>
+        <w:tc>
+          <w:tcPr/>
+          <w:p>
+            <w:pPr>
+              <w:pStyle w:val="Compact"/>
+            </w:pPr>
+            <w:r>
+              <w:t xml:space="preserve">Table:</w:t>
+            </w:r>
+            <w:r>
+              <w:t xml:space="preserve"> </w:t>
+            </w:r>
+            <w:r>
+              <w:rPr>
+                <w:rStyle w:val="VerbatimChar"/>
+              </w:rPr>
+              <w:t xml:space="preserve">id</w:t>
+            </w:r>
+            <w:r>
+              <w:t xml:space="preserve">,</w:t>
+            </w:r>
+            <w:r>
+              <w:t xml:space="preserve"> </w:t>
+            </w:r>
+            <w:r>
+              <w:rPr>
+                <w:rStyle w:val="VerbatimChar"/>
+              </w:rPr>
+              <w:t xml:space="preserve">user_id</w:t>
+            </w:r>
+            <w:r>
+              <w:t xml:space="preserve">,</w:t>
+            </w:r>
+            <w:r>
+              <w:t xml:space="preserve"> </w:t>
+            </w:r>
+            <w:r>
+              <w:rPr>
+                <w:rStyle w:val="VerbatimChar"/>
+              </w:rPr>
+              <w:t xml:space="preserve">action</w:t>
+            </w:r>
+            <w:r>
+              <w:t xml:space="preserve">,</w:t>
+            </w:r>
+            <w:r>
+              <w:t xml:space="preserve"> </w:t>
+            </w:r>
+            <w:r>
+              <w:rPr>
+                <w:rStyle w:val="VerbatimChar"/>
+              </w:rPr>
+              <w:t xml:space="preserve">resource_type</w:t>
+            </w:r>
+            <w:r>
+              <w:t xml:space="preserve">,</w:t>
+            </w:r>
+            <w:r>
+              <w:t xml:space="preserve"> </w:t>
+            </w:r>
+            <w:r>
+              <w:rPr>
+                <w:rStyle w:val="VerbatimChar"/>
+              </w:rPr>
+              <w:t xml:space="preserve">resource_id</w:t>
+            </w:r>
+            <w:r>
+              <w:t xml:space="preserve">,</w:t>
+            </w:r>
+            <w:r>
+              <w:t xml:space="preserve"> </w:t>
+            </w:r>
+            <w:r>
+              <w:rPr>
+                <w:rStyle w:val="VerbatimChar"/>
+              </w:rPr>
+              <w:t xml:space="preserve">details</w:t>
+            </w:r>
+            <w:r>
+              <w:t xml:space="preserve"> </w:t>
+            </w:r>
+            <w:r>
+              <w:t xml:space="preserve">(JSON),</w:t>
+            </w:r>
+            <w:r>
+              <w:t xml:space="preserve"> </w:t>
+            </w:r>
+            <w:r>
+              <w:rPr>
+                <w:rStyle w:val="VerbatimChar"/>
+              </w:rPr>
+              <w:t xml:space="preserve">ip_address</w:t>
+            </w:r>
+            <w:r>
+              <w:t xml:space="preserve">,</w:t>
+            </w:r>
+            <w:r>
+              <w:t xml:space="preserve"> </w:t>
+            </w:r>
+            <w:r>
+              <w:rPr>
+                <w:rStyle w:val="VerbatimChar"/>
+              </w:rPr>
+              <w:t xml:space="preserve">timestamp</w:t>
+            </w:r>
+            <w:r>
+              <w:t xml:space="preserve">.</w:t>
+            </w:r>
+          </w:p>
+        </w:tc>
+        <w:tc>
+          <w:tcPr/>
+          <w:p>
+            <w:pPr>
+              <w:pStyle w:val="Compact"/>
+            </w:pPr>
+            <w:r>
+              <w:rPr>
+                <w:rStyle w:val="VerbatimChar"/>
+              </w:rPr>
+              <w:t xml:space="preserve">storage/db.py</w:t>
+            </w:r>
+          </w:p>
+        </w:tc>
+      </w:tr>
+      <w:tr>
+        <w:tc>
+          <w:tcPr/>
+          <w:p>
+            <w:pPr>
+              <w:pStyle w:val="Compact"/>
+            </w:pPr>
+            <w:r>
+              <w:t xml:space="preserve">32</w:t>
+            </w:r>
+          </w:p>
+        </w:tc>
+        <w:tc>
+          <w:tcPr/>
+          <w:p>
+            <w:pPr>
+              <w:pStyle w:val="Compact"/>
+            </w:pPr>
+            <w:r>
+              <w:rPr>
+                <w:b/>
+                <w:bCs/>
+              </w:rPr>
+              <w:t xml:space="preserve">Audit logging middleware</w:t>
+            </w:r>
+          </w:p>
+        </w:tc>
+        <w:tc>
+          <w:tcPr/>
+          <w:p>
+            <w:pPr>
+              <w:pStyle w:val="Compact"/>
+            </w:pPr>
+            <w:r>
+              <w:t xml:space="preserve">Auto-write</w:t>
+            </w:r>
+            <w:r>
+              <w:t xml:space="preserve"> </w:t>
+            </w:r>
+            <w:r>
+              <w:rPr>
+                <w:rStyle w:val="VerbatimChar"/>
+              </w:rPr>
+              <w:t xml:space="preserve">AuditLog</w:t>
+            </w:r>
+            <w:r>
+              <w:t xml:space="preserve"> </w:t>
+            </w:r>
+            <w:r>
+              <w:t xml:space="preserve">entry for every mutating action (POST/PUT/DELETE) with authenticated user info.</w:t>
+            </w:r>
+          </w:p>
+        </w:tc>
+        <w:tc>
+          <w:tcPr/>
+          <w:p>
+            <w:pPr>
+              <w:pStyle w:val="Compact"/>
+            </w:pPr>
+            <w:r>
+              <w:rPr>
+                <w:rStyle w:val="VerbatimChar"/>
+              </w:rPr>
+              <w:t xml:space="preserve">api/main.py</w:t>
+            </w:r>
+            <w:r>
+              <w:t xml:space="preserve">, new:</w:t>
+            </w:r>
+            <w:r>
+              <w:t xml:space="preserve"> </w:t>
+            </w:r>
+            <w:r>
+              <w:rPr>
+                <w:rStyle w:val="VerbatimChar"/>
+              </w:rPr>
+              <w:t xml:space="preserve">api/audit.py</w:t>
+            </w:r>
+          </w:p>
+        </w:tc>
+      </w:tr>
+      <w:tr>
+        <w:tc>
+          <w:tcPr/>
+          <w:p>
+            <w:pPr>
+              <w:pStyle w:val="Compact"/>
+            </w:pPr>
+            <w:r>
+              <w:t xml:space="preserve">33</w:t>
+            </w:r>
+          </w:p>
+        </w:tc>
+        <w:tc>
+          <w:tcPr/>
+          <w:p>
+            <w:pPr>
+              <w:pStyle w:val="Compact"/>
+            </w:pPr>
+            <w:r>
+              <w:rPr>
+                <w:b/>
+                <w:bCs/>
+              </w:rPr>
+              <w:t xml:space="preserve">Audit log viewer (Admin)</w:t>
+            </w:r>
+          </w:p>
+        </w:tc>
+        <w:tc>
+          <w:tcPr/>
+          <w:p>
+            <w:pPr>
+              <w:pStyle w:val="Compact"/>
+            </w:pPr>
+            <w:r>
+              <w:t xml:space="preserve">New</w:t>
+            </w:r>
+            <w:r>
+              <w:t xml:space="preserve"> </w:t>
+            </w:r>
+            <w:r>
+              <w:rPr>
+                <w:rStyle w:val="VerbatimChar"/>
+              </w:rPr>
+              <w:t xml:space="preserve">/app/audit</w:t>
+            </w:r>
+            <w:r>
+              <w:t xml:space="preserve"> </w:t>
+            </w:r>
+            <w:r>
+              <w:t xml:space="preserve">page: searchable, filterable table. Filters by user, action type, date range.</w:t>
+            </w:r>
+          </w:p>
+        </w:tc>
+        <w:tc>
+          <w:tcPr/>
+          <w:p>
+            <w:pPr>
+              <w:pStyle w:val="Compact"/>
+            </w:pPr>
+            <w:r>
+              <w:t xml:space="preserve">New:</w:t>
+            </w:r>
+            <w:r>
+              <w:t xml:space="preserve"> </w:t>
+            </w:r>
+            <w:r>
+              <w:rPr>
+                <w:rStyle w:val="VerbatimChar"/>
+              </w:rPr>
+              <w:t xml:space="preserve">web/src/app/app/audit/page.tsx</w:t>
+            </w:r>
+          </w:p>
+        </w:tc>
+      </w:tr>
+      <w:tr>
+        <w:tc>
+          <w:tcPr/>
+          <w:p>
+            <w:pPr>
+              <w:pStyle w:val="Compact"/>
+            </w:pPr>
+            <w:r>
+              <w:t xml:space="preserve">34</w:t>
+            </w:r>
+          </w:p>
+        </w:tc>
+        <w:tc>
+          <w:tcPr/>
+          <w:p>
+            <w:pPr>
+              <w:pStyle w:val="Compact"/>
+            </w:pPr>
+            <w:r>
+              <w:rPr>
+                <w:b/>
+                <w:bCs/>
+              </w:rPr>
+              <w:t xml:space="preserve">Data retention policy</w:t>
+            </w:r>
+          </w:p>
+        </w:tc>
+        <w:tc>
+          <w:tcPr/>
+          <w:p>
+            <w:pPr>
+              <w:pStyle w:val="Compact"/>
+            </w:pPr>
+            <w:r>
+              <w:t xml:space="preserve">Background task (APScheduler) deleting old</w:t>
+            </w:r>
+            <w:r>
+              <w:t xml:space="preserve"> </w:t>
+            </w:r>
+            <w:r>
+              <w:rPr>
+                <w:rStyle w:val="VerbatimChar"/>
+              </w:rPr>
+              <w:t xml:space="preserve">AnalysisRun</w:t>
+            </w:r>
+            <w:r>
+              <w:t xml:space="preserve"> </w:t>
+            </w:r>
+            <w:r>
+              <w:t xml:space="preserve">and</w:t>
+            </w:r>
+            <w:r>
+              <w:t xml:space="preserve"> </w:t>
+            </w:r>
+            <w:r>
+              <w:rPr>
+                <w:rStyle w:val="VerbatimChar"/>
+              </w:rPr>
+              <w:t xml:space="preserve">AuditLog</w:t>
+            </w:r>
+            <w:r>
+              <w:t xml:space="preserve"> </w:t>
+            </w:r>
+            <w:r>
+              <w:t xml:space="preserve">records past</w:t>
+            </w:r>
+            <w:r>
+              <w:t xml:space="preserve"> </w:t>
+            </w:r>
+            <w:r>
+              <w:rPr>
+                <w:rStyle w:val="VerbatimChar"/>
+              </w:rPr>
+              <w:t xml:space="preserve">retention_days</w:t>
+            </w:r>
+            <w:r>
+              <w:t xml:space="preserve">.</w:t>
+            </w:r>
+          </w:p>
+        </w:tc>
+        <w:tc>
+          <w:tcPr/>
+          <w:p>
+            <w:pPr>
+              <w:pStyle w:val="Compact"/>
+            </w:pPr>
+            <w:r>
+              <w:rPr>
+                <w:rStyle w:val="VerbatimChar"/>
+              </w:rPr>
+              <w:t xml:space="preserve">api/main.py</w:t>
+            </w:r>
+            <w:r>
+              <w:t xml:space="preserve">, new:</w:t>
+            </w:r>
+            <w:r>
+              <w:t xml:space="preserve"> </w:t>
+            </w:r>
+            <w:r>
+              <w:rPr>
+                <w:rStyle w:val="VerbatimChar"/>
+              </w:rPr>
+              <w:t xml:space="preserve">api/scheduler.py</w:t>
+            </w:r>
+          </w:p>
+        </w:tc>
+      </w:tr>
+    </w:tbl>
+    <w:p>
+      <w:r>
+        <w:pict>
+          <v:rect style="width:0;height:1.5pt" o:hralign="center" o:hrstd="t" o:hr="t"/>
+        </w:pict>
+      </w:r>
+    </w:p>
+    <w:bookmarkEnd w:id="15"/>
+    <w:bookmarkStart w:id="16" w:name="phase-8-cicd-quality-gates-tasks-4649"/>
+    <w:p>
+      <w:pPr>
+        <w:pStyle w:val="Heading2"/>
+      </w:pPr>
+      <w:r>
+        <w:t xml:space="preserve">Phase 8: CI/CD &amp; Quality Gates (Tasks 46–49)</w:t>
+      </w:r>
+    </w:p>
+    <w:p>
+      <w:pPr>
+        <w:pStyle w:val="FirstParagraph"/>
+      </w:pPr>
+      <w:r>
+        <w:rPr>
+          <w:i/>
+          <w:iCs/>
+        </w:rPr>
+        <w:t xml:space="preserve">Goal: Automated testing and deployment on every git push.</w:t>
+      </w:r>
+    </w:p>
+    <w:tbl>
+      <w:tblPr>
+        <w:tblStyle w:val="Table"/>
+        <w:tblW w:type="pct" w:w="5000"/>
+        <w:tblLayout w:type="fixed"/>
+        <w:tblLook w:firstRow="1" w:lastRow="0" w:firstColumn="0" w:lastColumn="0" w:noHBand="0" w:noVBand="0" w:val="0020"/>
+      </w:tblPr>
+      <w:tblGrid>
+        <w:gridCol w:w="625"/>
+        <w:gridCol w:w="1250"/>
+        <w:gridCol w:w="2709"/>
+        <w:gridCol w:w="3334"/>
+      </w:tblGrid>
+      <w:tr>
+        <w:trPr>
+          <w:tblHeader w:val="on"/>
+        </w:trPr>
+        <w:tc>
+          <w:tcPr/>
+          <w:p>
+            <w:pPr>
+              <w:pStyle w:val="Compact"/>
+            </w:pPr>
+            <w:r>
+              <w:t xml:space="preserve">#</w:t>
+            </w:r>
+          </w:p>
+        </w:tc>
+        <w:tc>
+          <w:tcPr/>
+          <w:p>
+            <w:pPr>
+              <w:pStyle w:val="Compact"/>
+            </w:pPr>
+            <w:r>
+              <w:t xml:space="preserve">Task</w:t>
+            </w:r>
+          </w:p>
+        </w:tc>
+        <w:tc>
+          <w:tcPr/>
+          <w:p>
+            <w:pPr>
+              <w:pStyle w:val="Compact"/>
+            </w:pPr>
+            <w:r>
+              <w:t xml:space="preserve">Description</w:t>
+            </w:r>
+          </w:p>
+        </w:tc>
+        <w:tc>
+          <w:tcPr/>
+          <w:p>
+            <w:pPr>
+              <w:pStyle w:val="Compact"/>
+            </w:pPr>
+            <w:r>
+              <w:t xml:space="preserve">Files Affected</w:t>
+            </w:r>
+          </w:p>
+        </w:tc>
+      </w:tr>
+      <w:tr>
+        <w:tc>
+          <w:tcPr/>
+          <w:p>
+            <w:pPr>
+              <w:pStyle w:val="Compact"/>
+            </w:pPr>
+            <w:r>
+              <w:t xml:space="preserve">46</w:t>
+            </w:r>
+          </w:p>
+        </w:tc>
+        <w:tc>
+          <w:tcPr/>
+          <w:p>
+            <w:pPr>
+              <w:pStyle w:val="Compact"/>
+            </w:pPr>
+            <w:r>
+              <w:rPr>
+                <w:b/>
+                <w:bCs/>
+              </w:rPr>
+              <w:t xml:space="preserve">GitHub Actions CI pipeline</w:t>
+            </w:r>
+          </w:p>
+        </w:tc>
+        <w:tc>
+          <w:tcPr/>
+          <w:p>
+            <w:pPr>
+              <w:pStyle w:val="Compact"/>
+            </w:pPr>
+            <w:r>
+              <w:t xml:space="preserve">On push/PR: install deps →</w:t>
+            </w:r>
+            <w:r>
+              <w:t xml:space="preserve"> </w:t>
+            </w:r>
+            <w:r>
+              <w:rPr>
+                <w:rStyle w:val="VerbatimChar"/>
+              </w:rPr>
+              <w:t xml:space="preserve">pytest</w:t>
+            </w:r>
+            <w:r>
+              <w:t xml:space="preserve"> </w:t>
+            </w:r>
+            <w:r>
+              <w:t xml:space="preserve">with coverage →</w:t>
+            </w:r>
+            <w:r>
+              <w:t xml:space="preserve"> </w:t>
+            </w:r>
+            <w:r>
+              <w:rPr>
+                <w:rStyle w:val="VerbatimChar"/>
+              </w:rPr>
+              <w:t xml:space="preserve">ruff</w:t>
+            </w:r>
+            <w:r>
+              <w:t xml:space="preserve"> </w:t>
+            </w:r>
+            <w:r>
+              <w:t xml:space="preserve">linter → fail if coverage &lt;80%.</w:t>
+            </w:r>
+          </w:p>
+        </w:tc>
+        <w:tc>
+          <w:tcPr/>
+          <w:p>
+            <w:pPr>
+              <w:pStyle w:val="Compact"/>
+            </w:pPr>
+            <w:r>
+              <w:t xml:space="preserve">New:</w:t>
+            </w:r>
+            <w:r>
+              <w:t xml:space="preserve"> </w:t>
+            </w:r>
+            <w:r>
+              <w:rPr>
+                <w:rStyle w:val="VerbatimChar"/>
+              </w:rPr>
+              <w:t xml:space="preserve">.github/workflows/ci.yml</w:t>
+            </w:r>
+          </w:p>
+        </w:tc>
+      </w:tr>
+      <w:tr>
+        <w:tc>
+          <w:tcPr/>
+          <w:p>
+            <w:pPr>
+              <w:pStyle w:val="Compact"/>
+            </w:pPr>
+            <w:r>
+              <w:t xml:space="preserve">47</w:t>
+            </w:r>
+          </w:p>
+        </w:tc>
+        <w:tc>
+          <w:tcPr/>
+          <w:p>
+            <w:pPr>
+              <w:pStyle w:val="Compact"/>
+            </w:pPr>
+            <w:r>
+              <w:rPr>
+                <w:b/>
+                <w:bCs/>
+              </w:rPr>
+              <w:t xml:space="preserve">Frontend linting &amp; type-checking</w:t>
+            </w:r>
+          </w:p>
+        </w:tc>
+        <w:tc>
+          <w:tcPr/>
+          <w:p>
+            <w:pPr>
+              <w:pStyle w:val="Compact"/>
+            </w:pPr>
+            <w:r>
+              <w:t xml:space="preserve">Extend CI:</w:t>
+            </w:r>
+            <w:r>
+              <w:t xml:space="preserve"> </w:t>
+            </w:r>
+            <w:r>
+              <w:rPr>
+                <w:rStyle w:val="VerbatimChar"/>
+              </w:rPr>
+              <w:t xml:space="preserve">npx tsc --noEmit</w:t>
+            </w:r>
+            <w:r>
+              <w:t xml:space="preserve"> </w:t>
+            </w:r>
+            <w:r>
+              <w:t xml:space="preserve">+</w:t>
+            </w:r>
+            <w:r>
+              <w:t xml:space="preserve"> </w:t>
+            </w:r>
+            <w:r>
+              <w:rPr>
+                <w:rStyle w:val="VerbatimChar"/>
+              </w:rPr>
+              <w:t xml:space="preserve">npx eslint .</w:t>
+            </w:r>
+            <w:r>
+              <w:t xml:space="preserve">. Fail on errors.</w:t>
+            </w:r>
+          </w:p>
+        </w:tc>
+        <w:tc>
+          <w:tcPr/>
+          <w:p>
+            <w:pPr>
+              <w:pStyle w:val="Compact"/>
+            </w:pPr>
+            <w:r>
+              <w:rPr>
+                <w:rStyle w:val="VerbatimChar"/>
+              </w:rPr>
+              <w:t xml:space="preserve">.github/workflows/ci.yml</w:t>
+            </w:r>
+          </w:p>
+        </w:tc>
+      </w:tr>
+      <w:tr>
+        <w:tc>
+          <w:tcPr/>
+          <w:p>
+            <w:pPr>
+              <w:pStyle w:val="Compact"/>
+            </w:pPr>
+            <w:r>
+              <w:t xml:space="preserve">48</w:t>
+            </w:r>
+          </w:p>
+        </w:tc>
+        <w:tc>
+          <w:tcPr/>
+          <w:p>
+            <w:pPr>
+              <w:pStyle w:val="Compact"/>
+            </w:pPr>
+            <w:r>
+              <w:rPr>
+                <w:b/>
+                <w:bCs/>
+              </w:rPr>
+              <w:t xml:space="preserve">Docker image build &amp; push</w:t>
+            </w:r>
+          </w:p>
+        </w:tc>
+        <w:tc>
+          <w:tcPr/>
+          <w:p>
+            <w:pPr>
+              <w:pStyle w:val="Compact"/>
+            </w:pPr>
+            <w:r>
+              <w:t xml:space="preserve">On merge to</w:t>
+            </w:r>
+            <w:r>
+              <w:t xml:space="preserve"> </w:t>
+            </w:r>
+            <w:r>
+              <w:rPr>
+                <w:rStyle w:val="VerbatimChar"/>
+              </w:rPr>
+              <w:t xml:space="preserve">main</w:t>
+            </w:r>
+            <w:r>
+              <w:t xml:space="preserve">: build both images, tag with git SHA, push to</w:t>
+            </w:r>
+            <w:r>
+              <w:t xml:space="preserve"> </w:t>
+            </w:r>
+            <w:r>
+              <w:rPr>
+                <w:rStyle w:val="VerbatimChar"/>
+              </w:rPr>
+              <w:t xml:space="preserve">ghcr.io</w:t>
+            </w:r>
+            <w:r>
+              <w:t xml:space="preserve">.</w:t>
+            </w:r>
+          </w:p>
+        </w:tc>
+        <w:tc>
+          <w:tcPr/>
+          <w:p>
+            <w:pPr>
+              <w:pStyle w:val="Compact"/>
+            </w:pPr>
+            <w:r>
+              <w:rPr>
+                <w:rStyle w:val="VerbatimChar"/>
+              </w:rPr>
+              <w:t xml:space="preserve">.github/workflows/ci.yml</w:t>
+            </w:r>
+          </w:p>
+        </w:tc>
+      </w:tr>
+      <w:tr>
+        <w:tc>
+          <w:tcPr/>
+          <w:p>
+            <w:pPr>
+              <w:pStyle w:val="Compact"/>
+            </w:pPr>
+            <w:r>
+              <w:t xml:space="preserve">49</w:t>
+            </w:r>
+          </w:p>
+        </w:tc>
+        <w:tc>
+          <w:tcPr/>
+          <w:p>
+            <w:pPr>
+              <w:pStyle w:val="Compact"/>
+            </w:pPr>
+            <w:r>
+              <w:rPr>
+                <w:b/>
+                <w:bCs/>
+              </w:rPr>
+              <w:t xml:space="preserve">Kubernetes Helm chart</w:t>
+            </w:r>
+          </w:p>
+        </w:tc>
+        <w:tc>
+          <w:tcPr/>
+          <w:p>
+            <w:pPr>
+              <w:pStyle w:val="Compact"/>
+            </w:pPr>
+            <w:r>
+              <w:t xml:space="preserve">Templates: Deployment, Service, Ingress (TLS), ConfigMap, Secret, PVC.</w:t>
+            </w:r>
+          </w:p>
+        </w:tc>
+        <w:tc>
+          <w:tcPr/>
+          <w:p>
+            <w:pPr>
+              <w:pStyle w:val="Compact"/>
+            </w:pPr>
+            <w:r>
+              <w:t xml:space="preserve">New:</w:t>
+            </w:r>
+            <w:r>
+              <w:t xml:space="preserve"> </w:t>
+            </w:r>
+            <w:r>
+              <w:rPr>
+                <w:rStyle w:val="VerbatimChar"/>
+              </w:rPr>
+              <w:t xml:space="preserve">deploy/helm/semanticos/</w:t>
+            </w:r>
+          </w:p>
+        </w:tc>
+      </w:tr>
+    </w:tbl>
+    <w:p>
+      <w:r>
+        <w:pict>
+          <v:rect style="width:0;height:1.5pt" o:hralign="center" o:hrstd="t" o:hr="t"/>
+        </w:pict>
+      </w:r>
+    </w:p>
+    <w:bookmarkEnd w:id="16"/>
+    <w:bookmarkStart w:id="17" w:name="X55e8711536da3b0eab7f4295415290bd384dd09"/>
+    <w:p>
+      <w:pPr>
+        <w:pStyle w:val="Heading2"/>
+      </w:pPr>
+      <w:r>
+        <w:t xml:space="preserve">Phase 9: Alerting &amp; Notifications (Tasks 26–30)</w:t>
       </w:r>
     </w:p>
     <w:p>
@@ -3225,2047 +5266,6 @@
                 <w:rStyle w:val="VerbatimChar"/>
               </w:rPr>
               <w:t xml:space="preserve">storage/db.py</w:t>
-            </w:r>
-          </w:p>
-        </w:tc>
-      </w:tr>
-    </w:tbl>
-    <w:p>
-      <w:r>
-        <w:pict>
-          <v:rect style="width:0;height:1.5pt" o:hralign="center" o:hrstd="t" o:hr="t"/>
-        </w:pict>
-      </w:r>
-    </w:p>
-    <w:bookmarkEnd w:id="13"/>
-    <w:bookmarkStart w:id="14" w:name="X82113d8f63b65c6c1f078aee3cb629affad0b53"/>
-    <w:p>
-      <w:pPr>
-        <w:pStyle w:val="Heading2"/>
-      </w:pPr>
-      <w:r>
-        <w:t xml:space="preserve">Phase 6: Audit Trail &amp; Compliance (Tasks 31–34)</w:t>
-      </w:r>
-    </w:p>
-    <w:p>
-      <w:pPr>
-        <w:pStyle w:val="FirstParagraph"/>
-      </w:pPr>
-      <w:r>
-        <w:rPr>
-          <w:i/>
-          <w:iCs/>
-        </w:rPr>
-        <w:t xml:space="preserve">Goal: Meet SOC2 and enterprise compliance requirements.</w:t>
-      </w:r>
-    </w:p>
-    <w:tbl>
-      <w:tblPr>
-        <w:tblStyle w:val="Table"/>
-        <w:tblW w:type="pct" w:w="5000"/>
-        <w:tblLayout w:type="fixed"/>
-        <w:tblLook w:firstRow="1" w:lastRow="0" w:firstColumn="0" w:lastColumn="0" w:noHBand="0" w:noVBand="0" w:val="0020"/>
-      </w:tblPr>
-      <w:tblGrid>
-        <w:gridCol w:w="625"/>
-        <w:gridCol w:w="1250"/>
-        <w:gridCol w:w="2709"/>
-        <w:gridCol w:w="3334"/>
-      </w:tblGrid>
-      <w:tr>
-        <w:trPr>
-          <w:tblHeader w:val="on"/>
-        </w:trPr>
-        <w:tc>
-          <w:tcPr/>
-          <w:p>
-            <w:pPr>
-              <w:pStyle w:val="Compact"/>
-            </w:pPr>
-            <w:r>
-              <w:t xml:space="preserve">#</w:t>
-            </w:r>
-          </w:p>
-        </w:tc>
-        <w:tc>
-          <w:tcPr/>
-          <w:p>
-            <w:pPr>
-              <w:pStyle w:val="Compact"/>
-            </w:pPr>
-            <w:r>
-              <w:t xml:space="preserve">Task</w:t>
-            </w:r>
-          </w:p>
-        </w:tc>
-        <w:tc>
-          <w:tcPr/>
-          <w:p>
-            <w:pPr>
-              <w:pStyle w:val="Compact"/>
-            </w:pPr>
-            <w:r>
-              <w:t xml:space="preserve">Description</w:t>
-            </w:r>
-          </w:p>
-        </w:tc>
-        <w:tc>
-          <w:tcPr/>
-          <w:p>
-            <w:pPr>
-              <w:pStyle w:val="Compact"/>
-            </w:pPr>
-            <w:r>
-              <w:t xml:space="preserve">Files Affected</w:t>
-            </w:r>
-          </w:p>
-        </w:tc>
-      </w:tr>
-      <w:tr>
-        <w:tc>
-          <w:tcPr/>
-          <w:p>
-            <w:pPr>
-              <w:pStyle w:val="Compact"/>
-            </w:pPr>
-            <w:r>
-              <w:t xml:space="preserve">31</w:t>
-            </w:r>
-          </w:p>
-        </w:tc>
-        <w:tc>
-          <w:tcPr/>
-          <w:p>
-            <w:pPr>
-              <w:pStyle w:val="Compact"/>
-            </w:pPr>
-            <w:r>
-              <w:rPr>
-                <w:b/>
-                <w:bCs/>
-              </w:rPr>
-              <w:t xml:space="preserve">AuditLog database model</w:t>
-            </w:r>
-          </w:p>
-        </w:tc>
-        <w:tc>
-          <w:tcPr/>
-          <w:p>
-            <w:pPr>
-              <w:pStyle w:val="Compact"/>
-            </w:pPr>
-            <w:r>
-              <w:t xml:space="preserve">Table:</w:t>
-            </w:r>
-            <w:r>
-              <w:t xml:space="preserve"> </w:t>
-            </w:r>
-            <w:r>
-              <w:rPr>
-                <w:rStyle w:val="VerbatimChar"/>
-              </w:rPr>
-              <w:t xml:space="preserve">id</w:t>
-            </w:r>
-            <w:r>
-              <w:t xml:space="preserve">,</w:t>
-            </w:r>
-            <w:r>
-              <w:t xml:space="preserve"> </w:t>
-            </w:r>
-            <w:r>
-              <w:rPr>
-                <w:rStyle w:val="VerbatimChar"/>
-              </w:rPr>
-              <w:t xml:space="preserve">user_id</w:t>
-            </w:r>
-            <w:r>
-              <w:t xml:space="preserve">,</w:t>
-            </w:r>
-            <w:r>
-              <w:t xml:space="preserve"> </w:t>
-            </w:r>
-            <w:r>
-              <w:rPr>
-                <w:rStyle w:val="VerbatimChar"/>
-              </w:rPr>
-              <w:t xml:space="preserve">action</w:t>
-            </w:r>
-            <w:r>
-              <w:t xml:space="preserve">,</w:t>
-            </w:r>
-            <w:r>
-              <w:t xml:space="preserve"> </w:t>
-            </w:r>
-            <w:r>
-              <w:rPr>
-                <w:rStyle w:val="VerbatimChar"/>
-              </w:rPr>
-              <w:t xml:space="preserve">resource_type</w:t>
-            </w:r>
-            <w:r>
-              <w:t xml:space="preserve">,</w:t>
-            </w:r>
-            <w:r>
-              <w:t xml:space="preserve"> </w:t>
-            </w:r>
-            <w:r>
-              <w:rPr>
-                <w:rStyle w:val="VerbatimChar"/>
-              </w:rPr>
-              <w:t xml:space="preserve">resource_id</w:t>
-            </w:r>
-            <w:r>
-              <w:t xml:space="preserve">,</w:t>
-            </w:r>
-            <w:r>
-              <w:t xml:space="preserve"> </w:t>
-            </w:r>
-            <w:r>
-              <w:rPr>
-                <w:rStyle w:val="VerbatimChar"/>
-              </w:rPr>
-              <w:t xml:space="preserve">details</w:t>
-            </w:r>
-            <w:r>
-              <w:t xml:space="preserve"> </w:t>
-            </w:r>
-            <w:r>
-              <w:t xml:space="preserve">(JSON),</w:t>
-            </w:r>
-            <w:r>
-              <w:t xml:space="preserve"> </w:t>
-            </w:r>
-            <w:r>
-              <w:rPr>
-                <w:rStyle w:val="VerbatimChar"/>
-              </w:rPr>
-              <w:t xml:space="preserve">ip_address</w:t>
-            </w:r>
-            <w:r>
-              <w:t xml:space="preserve">,</w:t>
-            </w:r>
-            <w:r>
-              <w:t xml:space="preserve"> </w:t>
-            </w:r>
-            <w:r>
-              <w:rPr>
-                <w:rStyle w:val="VerbatimChar"/>
-              </w:rPr>
-              <w:t xml:space="preserve">timestamp</w:t>
-            </w:r>
-            <w:r>
-              <w:t xml:space="preserve">.</w:t>
-            </w:r>
-          </w:p>
-        </w:tc>
-        <w:tc>
-          <w:tcPr/>
-          <w:p>
-            <w:pPr>
-              <w:pStyle w:val="Compact"/>
-            </w:pPr>
-            <w:r>
-              <w:rPr>
-                <w:rStyle w:val="VerbatimChar"/>
-              </w:rPr>
-              <w:t xml:space="preserve">storage/db.py</w:t>
-            </w:r>
-          </w:p>
-        </w:tc>
-      </w:tr>
-      <w:tr>
-        <w:tc>
-          <w:tcPr/>
-          <w:p>
-            <w:pPr>
-              <w:pStyle w:val="Compact"/>
-            </w:pPr>
-            <w:r>
-              <w:t xml:space="preserve">32</w:t>
-            </w:r>
-          </w:p>
-        </w:tc>
-        <w:tc>
-          <w:tcPr/>
-          <w:p>
-            <w:pPr>
-              <w:pStyle w:val="Compact"/>
-            </w:pPr>
-            <w:r>
-              <w:rPr>
-                <w:b/>
-                <w:bCs/>
-              </w:rPr>
-              <w:t xml:space="preserve">Audit logging middleware</w:t>
-            </w:r>
-          </w:p>
-        </w:tc>
-        <w:tc>
-          <w:tcPr/>
-          <w:p>
-            <w:pPr>
-              <w:pStyle w:val="Compact"/>
-            </w:pPr>
-            <w:r>
-              <w:t xml:space="preserve">Auto-write</w:t>
-            </w:r>
-            <w:r>
-              <w:t xml:space="preserve"> </w:t>
-            </w:r>
-            <w:r>
-              <w:rPr>
-                <w:rStyle w:val="VerbatimChar"/>
-              </w:rPr>
-              <w:t xml:space="preserve">AuditLog</w:t>
-            </w:r>
-            <w:r>
-              <w:t xml:space="preserve"> </w:t>
-            </w:r>
-            <w:r>
-              <w:t xml:space="preserve">entry for every mutating action (POST/PUT/DELETE) with authenticated user info.</w:t>
-            </w:r>
-          </w:p>
-        </w:tc>
-        <w:tc>
-          <w:tcPr/>
-          <w:p>
-            <w:pPr>
-              <w:pStyle w:val="Compact"/>
-            </w:pPr>
-            <w:r>
-              <w:rPr>
-                <w:rStyle w:val="VerbatimChar"/>
-              </w:rPr>
-              <w:t xml:space="preserve">api/main.py</w:t>
-            </w:r>
-            <w:r>
-              <w:t xml:space="preserve">, new:</w:t>
-            </w:r>
-            <w:r>
-              <w:t xml:space="preserve"> </w:t>
-            </w:r>
-            <w:r>
-              <w:rPr>
-                <w:rStyle w:val="VerbatimChar"/>
-              </w:rPr>
-              <w:t xml:space="preserve">api/audit.py</w:t>
-            </w:r>
-          </w:p>
-        </w:tc>
-      </w:tr>
-      <w:tr>
-        <w:tc>
-          <w:tcPr/>
-          <w:p>
-            <w:pPr>
-              <w:pStyle w:val="Compact"/>
-            </w:pPr>
-            <w:r>
-              <w:t xml:space="preserve">33</w:t>
-            </w:r>
-          </w:p>
-        </w:tc>
-        <w:tc>
-          <w:tcPr/>
-          <w:p>
-            <w:pPr>
-              <w:pStyle w:val="Compact"/>
-            </w:pPr>
-            <w:r>
-              <w:rPr>
-                <w:b/>
-                <w:bCs/>
-              </w:rPr>
-              <w:t xml:space="preserve">Audit log viewer (Admin)</w:t>
-            </w:r>
-          </w:p>
-        </w:tc>
-        <w:tc>
-          <w:tcPr/>
-          <w:p>
-            <w:pPr>
-              <w:pStyle w:val="Compact"/>
-            </w:pPr>
-            <w:r>
-              <w:t xml:space="preserve">New</w:t>
-            </w:r>
-            <w:r>
-              <w:t xml:space="preserve"> </w:t>
-            </w:r>
-            <w:r>
-              <w:rPr>
-                <w:rStyle w:val="VerbatimChar"/>
-              </w:rPr>
-              <w:t xml:space="preserve">/app/audit</w:t>
-            </w:r>
-            <w:r>
-              <w:t xml:space="preserve"> </w:t>
-            </w:r>
-            <w:r>
-              <w:t xml:space="preserve">page: searchable, filterable table. Filters by user, action type, date range.</w:t>
-            </w:r>
-          </w:p>
-        </w:tc>
-        <w:tc>
-          <w:tcPr/>
-          <w:p>
-            <w:pPr>
-              <w:pStyle w:val="Compact"/>
-            </w:pPr>
-            <w:r>
-              <w:t xml:space="preserve">New:</w:t>
-            </w:r>
-            <w:r>
-              <w:t xml:space="preserve"> </w:t>
-            </w:r>
-            <w:r>
-              <w:rPr>
-                <w:rStyle w:val="VerbatimChar"/>
-              </w:rPr>
-              <w:t xml:space="preserve">web/src/app/app/audit/page.tsx</w:t>
-            </w:r>
-          </w:p>
-        </w:tc>
-      </w:tr>
-      <w:tr>
-        <w:tc>
-          <w:tcPr/>
-          <w:p>
-            <w:pPr>
-              <w:pStyle w:val="Compact"/>
-            </w:pPr>
-            <w:r>
-              <w:t xml:space="preserve">34</w:t>
-            </w:r>
-          </w:p>
-        </w:tc>
-        <w:tc>
-          <w:tcPr/>
-          <w:p>
-            <w:pPr>
-              <w:pStyle w:val="Compact"/>
-            </w:pPr>
-            <w:r>
-              <w:rPr>
-                <w:b/>
-                <w:bCs/>
-              </w:rPr>
-              <w:t xml:space="preserve">Data retention policy</w:t>
-            </w:r>
-          </w:p>
-        </w:tc>
-        <w:tc>
-          <w:tcPr/>
-          <w:p>
-            <w:pPr>
-              <w:pStyle w:val="Compact"/>
-            </w:pPr>
-            <w:r>
-              <w:t xml:space="preserve">Background task (APScheduler) deleting old</w:t>
-            </w:r>
-            <w:r>
-              <w:t xml:space="preserve"> </w:t>
-            </w:r>
-            <w:r>
-              <w:rPr>
-                <w:rStyle w:val="VerbatimChar"/>
-              </w:rPr>
-              <w:t xml:space="preserve">AnalysisRun</w:t>
-            </w:r>
-            <w:r>
-              <w:t xml:space="preserve"> </w:t>
-            </w:r>
-            <w:r>
-              <w:t xml:space="preserve">and</w:t>
-            </w:r>
-            <w:r>
-              <w:t xml:space="preserve"> </w:t>
-            </w:r>
-            <w:r>
-              <w:rPr>
-                <w:rStyle w:val="VerbatimChar"/>
-              </w:rPr>
-              <w:t xml:space="preserve">AuditLog</w:t>
-            </w:r>
-            <w:r>
-              <w:t xml:space="preserve"> </w:t>
-            </w:r>
-            <w:r>
-              <w:t xml:space="preserve">records past</w:t>
-            </w:r>
-            <w:r>
-              <w:t xml:space="preserve"> </w:t>
-            </w:r>
-            <w:r>
-              <w:rPr>
-                <w:rStyle w:val="VerbatimChar"/>
-              </w:rPr>
-              <w:t xml:space="preserve">retention_days</w:t>
-            </w:r>
-            <w:r>
-              <w:t xml:space="preserve">.</w:t>
-            </w:r>
-          </w:p>
-        </w:tc>
-        <w:tc>
-          <w:tcPr/>
-          <w:p>
-            <w:pPr>
-              <w:pStyle w:val="Compact"/>
-            </w:pPr>
-            <w:r>
-              <w:rPr>
-                <w:rStyle w:val="VerbatimChar"/>
-              </w:rPr>
-              <w:t xml:space="preserve">api/main.py</w:t>
-            </w:r>
-            <w:r>
-              <w:t xml:space="preserve">, new:</w:t>
-            </w:r>
-            <w:r>
-              <w:t xml:space="preserve"> </w:t>
-            </w:r>
-            <w:r>
-              <w:rPr>
-                <w:rStyle w:val="VerbatimChar"/>
-              </w:rPr>
-              <w:t xml:space="preserve">api/scheduler.py</w:t>
-            </w:r>
-          </w:p>
-        </w:tc>
-      </w:tr>
-    </w:tbl>
-    <w:p>
-      <w:r>
-        <w:pict>
-          <v:rect style="width:0;height:1.5pt" o:hralign="center" o:hrstd="t" o:hr="t"/>
-        </w:pict>
-      </w:r>
-    </w:p>
-    <w:bookmarkEnd w:id="14"/>
-    <w:bookmarkStart w:id="15" w:name="X44df4c0995532ea189f02ac2e2b0934fc9455a7"/>
-    <w:p>
-      <w:pPr>
-        <w:pStyle w:val="Heading2"/>
-      </w:pPr>
-      <w:r>
-        <w:t xml:space="preserve">Phase 7: Storage, Data Lifecycle &amp; Distributed Scale (Tasks 35–40)</w:t>
-      </w:r>
-    </w:p>
-    <w:p>
-      <w:pPr>
-        <w:pStyle w:val="FirstParagraph"/>
-      </w:pPr>
-      <w:r>
-        <w:rPr>
-          <w:i/>
-          <w:iCs/>
-        </w:rPr>
-        <w:t xml:space="preserve">Goal: Handle petabyte-scale log volumes — closing the infrastructure gap vs Splunk.</w:t>
-      </w:r>
-    </w:p>
-    <w:tbl>
-      <w:tblPr>
-        <w:tblStyle w:val="Table"/>
-        <w:tblW w:type="pct" w:w="5000"/>
-        <w:tblLayout w:type="fixed"/>
-        <w:tblLook w:firstRow="1" w:lastRow="0" w:firstColumn="0" w:lastColumn="0" w:noHBand="0" w:noVBand="0" w:val="0020"/>
-      </w:tblPr>
-      <w:tblGrid>
-        <w:gridCol w:w="625"/>
-        <w:gridCol w:w="1250"/>
-        <w:gridCol w:w="2709"/>
-        <w:gridCol w:w="3334"/>
-      </w:tblGrid>
-      <w:tr>
-        <w:trPr>
-          <w:tblHeader w:val="on"/>
-        </w:trPr>
-        <w:tc>
-          <w:tcPr/>
-          <w:p>
-            <w:pPr>
-              <w:pStyle w:val="Compact"/>
-            </w:pPr>
-            <w:r>
-              <w:t xml:space="preserve">#</w:t>
-            </w:r>
-          </w:p>
-        </w:tc>
-        <w:tc>
-          <w:tcPr/>
-          <w:p>
-            <w:pPr>
-              <w:pStyle w:val="Compact"/>
-            </w:pPr>
-            <w:r>
-              <w:t xml:space="preserve">Task</w:t>
-            </w:r>
-          </w:p>
-        </w:tc>
-        <w:tc>
-          <w:tcPr/>
-          <w:p>
-            <w:pPr>
-              <w:pStyle w:val="Compact"/>
-            </w:pPr>
-            <w:r>
-              <w:t xml:space="preserve">Description</w:t>
-            </w:r>
-          </w:p>
-        </w:tc>
-        <w:tc>
-          <w:tcPr/>
-          <w:p>
-            <w:pPr>
-              <w:pStyle w:val="Compact"/>
-            </w:pPr>
-            <w:r>
-              <w:t xml:space="preserve">Files Affected</w:t>
-            </w:r>
-          </w:p>
-        </w:tc>
-      </w:tr>
-      <w:tr>
-        <w:tc>
-          <w:tcPr/>
-          <w:p>
-            <w:pPr>
-              <w:pStyle w:val="Compact"/>
-            </w:pPr>
-            <w:r>
-              <w:t xml:space="preserve">35</w:t>
-            </w:r>
-          </w:p>
-        </w:tc>
-        <w:tc>
-          <w:tcPr/>
-          <w:p>
-            <w:pPr>
-              <w:pStyle w:val="Compact"/>
-            </w:pPr>
-            <w:r>
-              <w:rPr>
-                <w:b/>
-                <w:bCs/>
-              </w:rPr>
-              <w:t xml:space="preserve">S3/MinIO object storage</w:t>
-            </w:r>
-          </w:p>
-        </w:tc>
-        <w:tc>
-          <w:tcPr/>
-          <w:p>
-            <w:pPr>
-              <w:pStyle w:val="Compact"/>
-            </w:pPr>
-            <w:r>
-              <w:t xml:space="preserve">Replace local</w:t>
-            </w:r>
-            <w:r>
-              <w:t xml:space="preserve"> </w:t>
-            </w:r>
-            <w:r>
-              <w:rPr>
-                <w:rStyle w:val="VerbatimChar"/>
-              </w:rPr>
-              <w:t xml:space="preserve">data/</w:t>
-            </w:r>
-            <w:r>
-              <w:t xml:space="preserve"> </w:t>
-            </w:r>
-            <w:r>
-              <w:t xml:space="preserve">with S3-compatible object store.</w:t>
-            </w:r>
-            <w:r>
-              <w:t xml:space="preserve"> </w:t>
-            </w:r>
-            <w:r>
-              <w:rPr>
-                <w:rStyle w:val="VerbatimChar"/>
-              </w:rPr>
-              <w:t xml:space="preserve">boto3</w:t>
-            </w:r>
-            <w:r>
-              <w:t xml:space="preserve"> </w:t>
-            </w:r>
-            <w:r>
-              <w:t xml:space="preserve">for AWS,</w:t>
-            </w:r>
-            <w:r>
-              <w:t xml:space="preserve"> </w:t>
-            </w:r>
-            <w:r>
-              <w:rPr>
-                <w:rStyle w:val="VerbatimChar"/>
-              </w:rPr>
-              <w:t xml:space="preserve">minio</w:t>
-            </w:r>
-            <w:r>
-              <w:t xml:space="preserve"> </w:t>
-            </w:r>
-            <w:r>
-              <w:t xml:space="preserve">client for self-hosted. Infinite scale at $0.023/GB/month.</w:t>
-            </w:r>
-          </w:p>
-        </w:tc>
-        <w:tc>
-          <w:tcPr/>
-          <w:p>
-            <w:pPr>
-              <w:pStyle w:val="Compact"/>
-            </w:pPr>
-            <w:r>
-              <w:t xml:space="preserve">New:</w:t>
-            </w:r>
-            <w:r>
-              <w:t xml:space="preserve"> </w:t>
-            </w:r>
-            <w:r>
-              <w:rPr>
-                <w:rStyle w:val="VerbatimChar"/>
-              </w:rPr>
-              <w:t xml:space="preserve">storage/object_store.py</w:t>
-            </w:r>
-            <w:r>
-              <w:t xml:space="preserve">,</w:t>
-            </w:r>
-            <w:r>
-              <w:t xml:space="preserve"> </w:t>
-            </w:r>
-            <w:r>
-              <w:rPr>
-                <w:rStyle w:val="VerbatimChar"/>
-              </w:rPr>
-              <w:t xml:space="preserve">api/main.py</w:t>
-            </w:r>
-          </w:p>
-        </w:tc>
-      </w:tr>
-      <w:tr>
-        <w:tc>
-          <w:tcPr/>
-          <w:p>
-            <w:pPr>
-              <w:pStyle w:val="Compact"/>
-            </w:pPr>
-            <w:r>
-              <w:t xml:space="preserve">36</w:t>
-            </w:r>
-          </w:p>
-        </w:tc>
-        <w:tc>
-          <w:tcPr/>
-          <w:p>
-            <w:pPr>
-              <w:pStyle w:val="Compact"/>
-            </w:pPr>
-            <w:r>
-              <w:rPr>
-                <w:b/>
-                <w:bCs/>
-              </w:rPr>
-              <w:t xml:space="preserve">Wire S3 into retention scheduler</w:t>
-            </w:r>
-          </w:p>
-        </w:tc>
-        <w:tc>
-          <w:tcPr/>
-          <w:p>
-            <w:pPr>
-              <w:pStyle w:val="Compact"/>
-            </w:pPr>
-            <w:r>
-              <w:t xml:space="preserve">Compress logs older than 7 days → upload to S3 → delete local. Add Storage section to Settings page.</w:t>
-            </w:r>
-          </w:p>
-        </w:tc>
-        <w:tc>
-          <w:tcPr/>
-          <w:p>
-            <w:pPr>
-              <w:pStyle w:val="Compact"/>
-            </w:pPr>
-            <w:r>
-              <w:rPr>
-                <w:rStyle w:val="VerbatimChar"/>
-              </w:rPr>
-              <w:t xml:space="preserve">api/scheduler.py</w:t>
-            </w:r>
-            <w:r>
-              <w:t xml:space="preserve">,</w:t>
-            </w:r>
-            <w:r>
-              <w:t xml:space="preserve"> </w:t>
-            </w:r>
-            <w:r>
-              <w:rPr>
-                <w:rStyle w:val="VerbatimChar"/>
-              </w:rPr>
-              <w:t xml:space="preserve">web/src/app/app/settings/page.tsx</w:t>
-            </w:r>
-          </w:p>
-        </w:tc>
-      </w:tr>
-      <w:tr>
-        <w:tc>
-          <w:tcPr/>
-          <w:p>
-            <w:pPr>
-              <w:pStyle w:val="Compact"/>
-            </w:pPr>
-            <w:r>
-              <w:t xml:space="preserve">37</w:t>
-            </w:r>
-          </w:p>
-        </w:tc>
-        <w:tc>
-          <w:tcPr/>
-          <w:p>
-            <w:pPr>
-              <w:pStyle w:val="Compact"/>
-            </w:pPr>
-            <w:r>
-              <w:rPr>
-                <w:b/>
-                <w:bCs/>
-              </w:rPr>
-              <w:t xml:space="preserve">Log file rotation</w:t>
-            </w:r>
-          </w:p>
-        </w:tc>
-        <w:tc>
-          <w:tcPr/>
-          <w:p>
-            <w:pPr>
-              <w:pStyle w:val="Compact"/>
-            </w:pPr>
-            <w:r>
-              <w:t xml:space="preserve">Auto-rotate</w:t>
-            </w:r>
-            <w:r>
-              <w:t xml:space="preserve"> </w:t>
-            </w:r>
-            <w:r>
-              <w:rPr>
-                <w:rStyle w:val="VerbatimChar"/>
-              </w:rPr>
-              <w:t xml:space="preserve">live_stream.log</w:t>
-            </w:r>
-            <w:r>
-              <w:t xml:space="preserve"> </w:t>
-            </w:r>
-            <w:r>
-              <w:t xml:space="preserve">at 100MB. Rename to</w:t>
-            </w:r>
-            <w:r>
-              <w:t xml:space="preserve"> </w:t>
-            </w:r>
-            <w:r>
-              <w:rPr>
-                <w:rStyle w:val="VerbatimChar"/>
-              </w:rPr>
-              <w:t xml:space="preserve">live_stream_&lt;timestamp&gt;.log</w:t>
-            </w:r>
-            <w:r>
-              <w:t xml:space="preserve">, create fresh file. Old files archived by S3.</w:t>
-            </w:r>
-          </w:p>
-        </w:tc>
-        <w:tc>
-          <w:tcPr/>
-          <w:p>
-            <w:pPr>
-              <w:pStyle w:val="Compact"/>
-            </w:pPr>
-            <w:r>
-              <w:rPr>
-                <w:rStyle w:val="VerbatimChar"/>
-              </w:rPr>
-              <w:t xml:space="preserve">api/main.py</w:t>
-            </w:r>
-          </w:p>
-        </w:tc>
-      </w:tr>
-      <w:tr>
-        <w:tc>
-          <w:tcPr/>
-          <w:p>
-            <w:pPr>
-              <w:pStyle w:val="Compact"/>
-            </w:pPr>
-            <w:r>
-              <w:t xml:space="preserve">38</w:t>
-            </w:r>
-          </w:p>
-        </w:tc>
-        <w:tc>
-          <w:tcPr/>
-          <w:p>
-            <w:pPr>
-              <w:pStyle w:val="Compact"/>
-            </w:pPr>
-            <w:r>
-              <w:rPr>
-                <w:b/>
-                <w:bCs/>
-              </w:rPr>
-              <w:t xml:space="preserve">Persistent vector database (LanceDB)</w:t>
-            </w:r>
-          </w:p>
-        </w:tc>
-        <w:tc>
-          <w:tcPr/>
-          <w:p>
-            <w:pPr>
-              <w:pStyle w:val="Compact"/>
-            </w:pPr>
-            <w:r>
-              <w:t xml:space="preserve">Store all embeddings persistently instead of discarding after analysis. Enables semantic search across all historical logs.</w:t>
-            </w:r>
-          </w:p>
-        </w:tc>
-        <w:tc>
-          <w:tcPr/>
-          <w:p>
-            <w:pPr>
-              <w:pStyle w:val="Compact"/>
-            </w:pPr>
-            <w:r>
-              <w:t xml:space="preserve">New:</w:t>
-            </w:r>
-            <w:r>
-              <w:t xml:space="preserve"> </w:t>
-            </w:r>
-            <w:r>
-              <w:rPr>
-                <w:rStyle w:val="VerbatimChar"/>
-              </w:rPr>
-              <w:t xml:space="preserve">storage/vector_store.py</w:t>
-            </w:r>
-            <w:r>
-              <w:t xml:space="preserve">, modify clustering pipeline</w:t>
-            </w:r>
-          </w:p>
-        </w:tc>
-      </w:tr>
-      <w:tr>
-        <w:tc>
-          <w:tcPr/>
-          <w:p>
-            <w:pPr>
-              <w:pStyle w:val="Compact"/>
-            </w:pPr>
-            <w:r>
-              <w:t xml:space="preserve">39</w:t>
-            </w:r>
-          </w:p>
-        </w:tc>
-        <w:tc>
-          <w:tcPr/>
-          <w:p>
-            <w:pPr>
-              <w:pStyle w:val="Compact"/>
-            </w:pPr>
-            <w:r>
-              <w:rPr>
-                <w:b/>
-                <w:bCs/>
-              </w:rPr>
-              <w:t xml:space="preserve">Redis/Celery async job queue</w:t>
-            </w:r>
-          </w:p>
-        </w:tc>
-        <w:tc>
-          <w:tcPr/>
-          <w:p>
-            <w:pPr>
-              <w:pStyle w:val="Compact"/>
-            </w:pPr>
-            <w:r>
-              <w:t xml:space="preserve">Replace synchronous</w:t>
-            </w:r>
-            <w:r>
-              <w:t xml:space="preserve"> </w:t>
-            </w:r>
-            <w:r>
-              <w:rPr>
-                <w:rStyle w:val="VerbatimChar"/>
-              </w:rPr>
-              <w:t xml:space="preserve">/analyze</w:t>
-            </w:r>
-            <w:r>
-              <w:t xml:space="preserve"> </w:t>
-            </w:r>
-            <w:r>
-              <w:t xml:space="preserve">with async jobs. API submits to Redis, workers process independently. Horizontal scaling.</w:t>
-            </w:r>
-          </w:p>
-        </w:tc>
-        <w:tc>
-          <w:tcPr/>
-          <w:p>
-            <w:pPr>
-              <w:pStyle w:val="Compact"/>
-            </w:pPr>
-            <w:r>
-              <w:t xml:space="preserve">New:</w:t>
-            </w:r>
-            <w:r>
-              <w:t xml:space="preserve"> </w:t>
-            </w:r>
-            <w:r>
-              <w:rPr>
-                <w:rStyle w:val="VerbatimChar"/>
-              </w:rPr>
-              <w:t xml:space="preserve">workers/analysis_worker.py</w:t>
-            </w:r>
-            <w:r>
-              <w:t xml:space="preserve">,</w:t>
-            </w:r>
-            <w:r>
-              <w:t xml:space="preserve"> </w:t>
-            </w:r>
-            <w:r>
-              <w:rPr>
-                <w:rStyle w:val="VerbatimChar"/>
-              </w:rPr>
-              <w:t xml:space="preserve">api/main.py</w:t>
-            </w:r>
-            <w:r>
-              <w:t xml:space="preserve">,</w:t>
-            </w:r>
-            <w:r>
-              <w:t xml:space="preserve"> </w:t>
-            </w:r>
-            <w:r>
-              <w:rPr>
-                <w:rStyle w:val="VerbatimChar"/>
-              </w:rPr>
-              <w:t xml:space="preserve">pyproject.toml</w:t>
-            </w:r>
-          </w:p>
-        </w:tc>
-      </w:tr>
-      <w:tr>
-        <w:tc>
-          <w:tcPr/>
-          <w:p>
-            <w:pPr>
-              <w:pStyle w:val="Compact"/>
-            </w:pPr>
-            <w:r>
-              <w:t xml:space="preserve">40</w:t>
-            </w:r>
-          </w:p>
-        </w:tc>
-        <w:tc>
-          <w:tcPr/>
-          <w:p>
-            <w:pPr>
-              <w:pStyle w:val="Compact"/>
-            </w:pPr>
-            <w:r>
-              <w:rPr>
-                <w:b/>
-                <w:bCs/>
-              </w:rPr>
-              <w:t xml:space="preserve">ClickHouse integration (advanced)</w:t>
-            </w:r>
-          </w:p>
-        </w:tc>
-        <w:tc>
-          <w:tcPr/>
-          <w:p>
-            <w:pPr>
-              <w:pStyle w:val="Compact"/>
-            </w:pPr>
-            <w:r>
-              <w:t xml:space="preserve">Columnar analytics DB for billion-row SQL queries in seconds. All ingested logs dual-written to ClickHouse. Replaces Splunk’s search.</w:t>
-            </w:r>
-          </w:p>
-        </w:tc>
-        <w:tc>
-          <w:tcPr/>
-          <w:p>
-            <w:pPr>
-              <w:pStyle w:val="Compact"/>
-            </w:pPr>
-            <w:r>
-              <w:t xml:space="preserve">New:</w:t>
-            </w:r>
-            <w:r>
-              <w:t xml:space="preserve"> </w:t>
-            </w:r>
-            <w:r>
-              <w:rPr>
-                <w:rStyle w:val="VerbatimChar"/>
-              </w:rPr>
-              <w:t xml:space="preserve">storage/clickhouse_store.py</w:t>
-            </w:r>
-            <w:r>
-              <w:t xml:space="preserve">,</w:t>
-            </w:r>
-            <w:r>
-              <w:t xml:space="preserve"> </w:t>
-            </w:r>
-            <w:r>
-              <w:rPr>
-                <w:rStyle w:val="VerbatimChar"/>
-              </w:rPr>
-              <w:t xml:space="preserve">pyproject.toml</w:t>
-            </w:r>
-          </w:p>
-        </w:tc>
-      </w:tr>
-    </w:tbl>
-    <w:p>
-      <w:r>
-        <w:pict>
-          <v:rect style="width:0;height:1.5pt" o:hralign="center" o:hrstd="t" o:hr="t"/>
-        </w:pict>
-      </w:r>
-    </w:p>
-    <w:bookmarkEnd w:id="15"/>
-    <w:bookmarkStart w:id="16" w:name="X00ef6510ab21e3b8191a6a4873870243441be98"/>
-    <w:p>
-      <w:pPr>
-        <w:pStyle w:val="Heading2"/>
-      </w:pPr>
-      <w:r>
-        <w:t xml:space="preserve">Phase 8: Containerization &amp; Deployment (Tasks 41–45)</w:t>
-      </w:r>
-    </w:p>
-    <w:p>
-      <w:pPr>
-        <w:pStyle w:val="FirstParagraph"/>
-      </w:pPr>
-      <w:r>
-        <w:rPr>
-          <w:i/>
-          <w:iCs/>
-        </w:rPr>
-        <w:t xml:space="preserve">Goal: Deployable anywhere with a single command.</w:t>
-      </w:r>
-    </w:p>
-    <w:tbl>
-      <w:tblPr>
-        <w:tblStyle w:val="Table"/>
-        <w:tblW w:type="pct" w:w="5000"/>
-        <w:tblLayout w:type="fixed"/>
-        <w:tblLook w:firstRow="1" w:lastRow="0" w:firstColumn="0" w:lastColumn="0" w:noHBand="0" w:noVBand="0" w:val="0020"/>
-      </w:tblPr>
-      <w:tblGrid>
-        <w:gridCol w:w="625"/>
-        <w:gridCol w:w="1250"/>
-        <w:gridCol w:w="2709"/>
-        <w:gridCol w:w="3334"/>
-      </w:tblGrid>
-      <w:tr>
-        <w:trPr>
-          <w:tblHeader w:val="on"/>
-        </w:trPr>
-        <w:tc>
-          <w:tcPr/>
-          <w:p>
-            <w:pPr>
-              <w:pStyle w:val="Compact"/>
-            </w:pPr>
-            <w:r>
-              <w:t xml:space="preserve">#</w:t>
-            </w:r>
-          </w:p>
-        </w:tc>
-        <w:tc>
-          <w:tcPr/>
-          <w:p>
-            <w:pPr>
-              <w:pStyle w:val="Compact"/>
-            </w:pPr>
-            <w:r>
-              <w:t xml:space="preserve">Task</w:t>
-            </w:r>
-          </w:p>
-        </w:tc>
-        <w:tc>
-          <w:tcPr/>
-          <w:p>
-            <w:pPr>
-              <w:pStyle w:val="Compact"/>
-            </w:pPr>
-            <w:r>
-              <w:t xml:space="preserve">Description</w:t>
-            </w:r>
-          </w:p>
-        </w:tc>
-        <w:tc>
-          <w:tcPr/>
-          <w:p>
-            <w:pPr>
-              <w:pStyle w:val="Compact"/>
-            </w:pPr>
-            <w:r>
-              <w:t xml:space="preserve">Files Affected</w:t>
-            </w:r>
-          </w:p>
-        </w:tc>
-      </w:tr>
-      <w:tr>
-        <w:tc>
-          <w:tcPr/>
-          <w:p>
-            <w:pPr>
-              <w:pStyle w:val="Compact"/>
-            </w:pPr>
-            <w:r>
-              <w:t xml:space="preserve">41</w:t>
-            </w:r>
-          </w:p>
-        </w:tc>
-        <w:tc>
-          <w:tcPr/>
-          <w:p>
-            <w:pPr>
-              <w:pStyle w:val="Compact"/>
-            </w:pPr>
-            <w:r>
-              <w:rPr>
-                <w:b/>
-                <w:bCs/>
-              </w:rPr>
-              <w:t xml:space="preserve">Backend Dockerfile</w:t>
-            </w:r>
-          </w:p>
-        </w:tc>
-        <w:tc>
-          <w:tcPr/>
-          <w:p>
-            <w:pPr>
-              <w:pStyle w:val="Compact"/>
-            </w:pPr>
-            <w:r>
-              <w:t xml:space="preserve">Multi-stage: build deps with</w:t>
-            </w:r>
-            <w:r>
-              <w:t xml:space="preserve"> </w:t>
-            </w:r>
-            <w:r>
-              <w:rPr>
-                <w:rStyle w:val="VerbatimChar"/>
-              </w:rPr>
-              <w:t xml:space="preserve">uv</w:t>
-            </w:r>
-            <w:r>
-              <w:t xml:space="preserve">, copy to slim image.</w:t>
-            </w:r>
-            <w:r>
-              <w:t xml:space="preserve"> </w:t>
-            </w:r>
-            <w:r>
-              <w:rPr>
-                <w:rStyle w:val="VerbatimChar"/>
-              </w:rPr>
-              <w:t xml:space="preserve">gunicorn</w:t>
-            </w:r>
-            <w:r>
-              <w:t xml:space="preserve"> </w:t>
-            </w:r>
-            <w:r>
-              <w:t xml:space="preserve">+</w:t>
-            </w:r>
-            <w:r>
-              <w:t xml:space="preserve"> </w:t>
-            </w:r>
-            <w:r>
-              <w:rPr>
-                <w:rStyle w:val="VerbatimChar"/>
-              </w:rPr>
-              <w:t xml:space="preserve">uvicorn</w:t>
-            </w:r>
-            <w:r>
-              <w:t xml:space="preserve"> </w:t>
-            </w:r>
-            <w:r>
-              <w:t xml:space="preserve">workers. Port 8000.</w:t>
-            </w:r>
-          </w:p>
-        </w:tc>
-        <w:tc>
-          <w:tcPr/>
-          <w:p>
-            <w:pPr>
-              <w:pStyle w:val="Compact"/>
-            </w:pPr>
-            <w:r>
-              <w:t xml:space="preserve">New:</w:t>
-            </w:r>
-            <w:r>
-              <w:t xml:space="preserve"> </w:t>
-            </w:r>
-            <w:r>
-              <w:rPr>
-                <w:rStyle w:val="VerbatimChar"/>
-              </w:rPr>
-              <w:t xml:space="preserve">Dockerfile</w:t>
-            </w:r>
-          </w:p>
-        </w:tc>
-      </w:tr>
-      <w:tr>
-        <w:tc>
-          <w:tcPr/>
-          <w:p>
-            <w:pPr>
-              <w:pStyle w:val="Compact"/>
-            </w:pPr>
-            <w:r>
-              <w:t xml:space="preserve">42</w:t>
-            </w:r>
-          </w:p>
-        </w:tc>
-        <w:tc>
-          <w:tcPr/>
-          <w:p>
-            <w:pPr>
-              <w:pStyle w:val="Compact"/>
-            </w:pPr>
-            <w:r>
-              <w:rPr>
-                <w:b/>
-                <w:bCs/>
-              </w:rPr>
-              <w:t xml:space="preserve">Frontend Dockerfile</w:t>
-            </w:r>
-          </w:p>
-        </w:tc>
-        <w:tc>
-          <w:tcPr/>
-          <w:p>
-            <w:pPr>
-              <w:pStyle w:val="Compact"/>
-            </w:pPr>
-            <w:r>
-              <w:t xml:space="preserve">Multi-stage:</w:t>
-            </w:r>
-            <w:r>
-              <w:t xml:space="preserve"> </w:t>
-            </w:r>
-            <w:r>
-              <w:rPr>
-                <w:rStyle w:val="VerbatimChar"/>
-              </w:rPr>
-              <w:t xml:space="preserve">npm run build</w:t>
-            </w:r>
-            <w:r>
-              <w:t xml:space="preserve"> </w:t>
-            </w:r>
-            <w:r>
-              <w:t xml:space="preserve">→</w:t>
-            </w:r>
-            <w:r>
-              <w:t xml:space="preserve"> </w:t>
-            </w:r>
-            <w:r>
-              <w:rPr>
-                <w:rStyle w:val="VerbatimChar"/>
-              </w:rPr>
-              <w:t xml:space="preserve">next start</w:t>
-            </w:r>
-            <w:r>
-              <w:t xml:space="preserve">. Port 3000.</w:t>
-            </w:r>
-          </w:p>
-        </w:tc>
-        <w:tc>
-          <w:tcPr/>
-          <w:p>
-            <w:pPr>
-              <w:pStyle w:val="Compact"/>
-            </w:pPr>
-            <w:r>
-              <w:t xml:space="preserve">New:</w:t>
-            </w:r>
-            <w:r>
-              <w:t xml:space="preserve"> </w:t>
-            </w:r>
-            <w:r>
-              <w:rPr>
-                <w:rStyle w:val="VerbatimChar"/>
-              </w:rPr>
-              <w:t xml:space="preserve">web/Dockerfile</w:t>
-            </w:r>
-          </w:p>
-        </w:tc>
-      </w:tr>
-      <w:tr>
-        <w:tc>
-          <w:tcPr/>
-          <w:p>
-            <w:pPr>
-              <w:pStyle w:val="Compact"/>
-            </w:pPr>
-            <w:r>
-              <w:t xml:space="preserve">43</w:t>
-            </w:r>
-          </w:p>
-        </w:tc>
-        <w:tc>
-          <w:tcPr/>
-          <w:p>
-            <w:pPr>
-              <w:pStyle w:val="Compact"/>
-            </w:pPr>
-            <w:r>
-              <w:rPr>
-                <w:b/>
-                <w:bCs/>
-              </w:rPr>
-              <w:t xml:space="preserve">docker-compose.yml</w:t>
-            </w:r>
-          </w:p>
-        </w:tc>
-        <w:tc>
-          <w:tcPr/>
-          <w:p>
-            <w:pPr>
-              <w:pStyle w:val="Compact"/>
-            </w:pPr>
-            <w:r>
-              <w:t xml:space="preserve">4 services:</w:t>
-            </w:r>
-            <w:r>
-              <w:t xml:space="preserve"> </w:t>
-            </w:r>
-            <w:r>
-              <w:rPr>
-                <w:rStyle w:val="VerbatimChar"/>
-              </w:rPr>
-              <w:t xml:space="preserve">api</w:t>
-            </w:r>
-            <w:r>
-              <w:t xml:space="preserve">,</w:t>
-            </w:r>
-            <w:r>
-              <w:t xml:space="preserve"> </w:t>
-            </w:r>
-            <w:r>
-              <w:rPr>
-                <w:rStyle w:val="VerbatimChar"/>
-              </w:rPr>
-              <w:t xml:space="preserve">web</w:t>
-            </w:r>
-            <w:r>
-              <w:t xml:space="preserve">,</w:t>
-            </w:r>
-            <w:r>
-              <w:t xml:space="preserve"> </w:t>
-            </w:r>
-            <w:r>
-              <w:rPr>
-                <w:rStyle w:val="VerbatimChar"/>
-              </w:rPr>
-              <w:t xml:space="preserve">db</w:t>
-            </w:r>
-            <w:r>
-              <w:t xml:space="preserve"> </w:t>
-            </w:r>
-            <w:r>
-              <w:t xml:space="preserve">(PostgreSQL),</w:t>
-            </w:r>
-            <w:r>
-              <w:t xml:space="preserve"> </w:t>
-            </w:r>
-            <w:r>
-              <w:rPr>
-                <w:rStyle w:val="VerbatimChar"/>
-              </w:rPr>
-              <w:t xml:space="preserve">redis</w:t>
-            </w:r>
-            <w:r>
-              <w:t xml:space="preserve">. Health checks, volumes, shared network.</w:t>
-            </w:r>
-          </w:p>
-        </w:tc>
-        <w:tc>
-          <w:tcPr/>
-          <w:p>
-            <w:pPr>
-              <w:pStyle w:val="Compact"/>
-            </w:pPr>
-            <w:r>
-              <w:t xml:space="preserve">New:</w:t>
-            </w:r>
-            <w:r>
-              <w:t xml:space="preserve"> </w:t>
-            </w:r>
-            <w:r>
-              <w:rPr>
-                <w:rStyle w:val="VerbatimChar"/>
-              </w:rPr>
-              <w:t xml:space="preserve">docker-compose.yml</w:t>
-            </w:r>
-          </w:p>
-        </w:tc>
-      </w:tr>
-      <w:tr>
-        <w:tc>
-          <w:tcPr/>
-          <w:p>
-            <w:pPr>
-              <w:pStyle w:val="Compact"/>
-            </w:pPr>
-            <w:r>
-              <w:t xml:space="preserve">44</w:t>
-            </w:r>
-          </w:p>
-        </w:tc>
-        <w:tc>
-          <w:tcPr/>
-          <w:p>
-            <w:pPr>
-              <w:pStyle w:val="Compact"/>
-            </w:pPr>
-            <w:r>
-              <w:rPr>
-                <w:b/>
-                <w:bCs/>
-              </w:rPr>
-              <w:t xml:space="preserve">HTTPS with Nginx reverse proxy</w:t>
-            </w:r>
-          </w:p>
-        </w:tc>
-        <w:tc>
-          <w:tcPr/>
-          <w:p>
-            <w:pPr>
-              <w:pStyle w:val="Compact"/>
-            </w:pPr>
-            <w:r>
-              <w:t xml:space="preserve">Add</w:t>
-            </w:r>
-            <w:r>
-              <w:t xml:space="preserve"> </w:t>
-            </w:r>
-            <w:r>
-              <w:rPr>
-                <w:rStyle w:val="VerbatimChar"/>
-              </w:rPr>
-              <w:t xml:space="preserve">nginx</w:t>
-            </w:r>
-            <w:r>
-              <w:t xml:space="preserve"> </w:t>
-            </w:r>
-            <w:r>
-              <w:t xml:space="preserve">service to compose. TLS termination. Self-signed certs for dev, real certs for prod.</w:t>
-            </w:r>
-          </w:p>
-        </w:tc>
-        <w:tc>
-          <w:tcPr/>
-          <w:p>
-            <w:pPr>
-              <w:pStyle w:val="Compact"/>
-            </w:pPr>
-            <w:r>
-              <w:t xml:space="preserve">New:</w:t>
-            </w:r>
-            <w:r>
-              <w:t xml:space="preserve"> </w:t>
-            </w:r>
-            <w:r>
-              <w:rPr>
-                <w:rStyle w:val="VerbatimChar"/>
-              </w:rPr>
-              <w:t xml:space="preserve">nginx/nginx.conf</w:t>
-            </w:r>
-            <w:r>
-              <w:t xml:space="preserve">,</w:t>
-            </w:r>
-            <w:r>
-              <w:t xml:space="preserve"> </w:t>
-            </w:r>
-            <w:r>
-              <w:rPr>
-                <w:rStyle w:val="VerbatimChar"/>
-              </w:rPr>
-              <w:t xml:space="preserve">docker-compose.yml</w:t>
-            </w:r>
-          </w:p>
-        </w:tc>
-      </w:tr>
-      <w:tr>
-        <w:tc>
-          <w:tcPr/>
-          <w:p>
-            <w:pPr>
-              <w:pStyle w:val="Compact"/>
-            </w:pPr>
-            <w:r>
-              <w:t xml:space="preserve">45</w:t>
-            </w:r>
-          </w:p>
-        </w:tc>
-        <w:tc>
-          <w:tcPr/>
-          <w:p>
-            <w:pPr>
-              <w:pStyle w:val="Compact"/>
-            </w:pPr>
-            <w:r>
-              <w:rPr>
-                <w:b/>
-                <w:bCs/>
-              </w:rPr>
-              <w:t xml:space="preserve">Redis pub/sub for WebSocket scaling</w:t>
-            </w:r>
-          </w:p>
-        </w:tc>
-        <w:tc>
-          <w:tcPr/>
-          <w:p>
-            <w:pPr>
-              <w:pStyle w:val="Compact"/>
-            </w:pPr>
-            <w:r>
-              <w:t xml:space="preserve">Replace in-process WebSocket with Redis pub/sub channel.</w:t>
-            </w:r>
-            <w:r>
-              <w:t xml:space="preserve"> </w:t>
-            </w:r>
-            <w:r>
-              <w:rPr>
-                <w:rStyle w:val="VerbatimChar"/>
-              </w:rPr>
-              <w:t xml:space="preserve">/ingest</w:t>
-            </w:r>
-            <w:r>
-              <w:t xml:space="preserve"> </w:t>
-            </w:r>
-            <w:r>
-              <w:t xml:space="preserve">publishes, all WS connections subscribe. Enables horizontal API scaling.</w:t>
-            </w:r>
-          </w:p>
-        </w:tc>
-        <w:tc>
-          <w:tcPr/>
-          <w:p>
-            <w:pPr>
-              <w:pStyle w:val="Compact"/>
-            </w:pPr>
-            <w:r>
-              <w:rPr>
-                <w:rStyle w:val="VerbatimChar"/>
-              </w:rPr>
-              <w:t xml:space="preserve">api/main.py</w:t>
-            </w:r>
-            <w:r>
-              <w:t xml:space="preserve">,</w:t>
-            </w:r>
-            <w:r>
-              <w:t xml:space="preserve"> </w:t>
-            </w:r>
-            <w:r>
-              <w:rPr>
-                <w:rStyle w:val="VerbatimChar"/>
-              </w:rPr>
-              <w:t xml:space="preserve">pyproject.toml</w:t>
-            </w:r>
-          </w:p>
-        </w:tc>
-      </w:tr>
-    </w:tbl>
-    <w:p>
-      <w:r>
-        <w:pict>
-          <v:rect style="width:0;height:1.5pt" o:hralign="center" o:hrstd="t" o:hr="t"/>
-        </w:pict>
-      </w:r>
-    </w:p>
-    <w:bookmarkEnd w:id="16"/>
-    <w:bookmarkStart w:id="17" w:name="phase-9-cicd-quality-gates-tasks-4649"/>
-    <w:p>
-      <w:pPr>
-        <w:pStyle w:val="Heading2"/>
-      </w:pPr>
-      <w:r>
-        <w:t xml:space="preserve">Phase 9: CI/CD &amp; Quality Gates (Tasks 46–49)</w:t>
-      </w:r>
-    </w:p>
-    <w:p>
-      <w:pPr>
-        <w:pStyle w:val="FirstParagraph"/>
-      </w:pPr>
-      <w:r>
-        <w:rPr>
-          <w:i/>
-          <w:iCs/>
-        </w:rPr>
-        <w:t xml:space="preserve">Goal: Automated testing and deployment on every git push.</w:t>
-      </w:r>
-    </w:p>
-    <w:tbl>
-      <w:tblPr>
-        <w:tblStyle w:val="Table"/>
-        <w:tblW w:type="pct" w:w="5000"/>
-        <w:tblLayout w:type="fixed"/>
-        <w:tblLook w:firstRow="1" w:lastRow="0" w:firstColumn="0" w:lastColumn="0" w:noHBand="0" w:noVBand="0" w:val="0020"/>
-      </w:tblPr>
-      <w:tblGrid>
-        <w:gridCol w:w="625"/>
-        <w:gridCol w:w="1250"/>
-        <w:gridCol w:w="2709"/>
-        <w:gridCol w:w="3334"/>
-      </w:tblGrid>
-      <w:tr>
-        <w:trPr>
-          <w:tblHeader w:val="on"/>
-        </w:trPr>
-        <w:tc>
-          <w:tcPr/>
-          <w:p>
-            <w:pPr>
-              <w:pStyle w:val="Compact"/>
-            </w:pPr>
-            <w:r>
-              <w:t xml:space="preserve">#</w:t>
-            </w:r>
-          </w:p>
-        </w:tc>
-        <w:tc>
-          <w:tcPr/>
-          <w:p>
-            <w:pPr>
-              <w:pStyle w:val="Compact"/>
-            </w:pPr>
-            <w:r>
-              <w:t xml:space="preserve">Task</w:t>
-            </w:r>
-          </w:p>
-        </w:tc>
-        <w:tc>
-          <w:tcPr/>
-          <w:p>
-            <w:pPr>
-              <w:pStyle w:val="Compact"/>
-            </w:pPr>
-            <w:r>
-              <w:t xml:space="preserve">Description</w:t>
-            </w:r>
-          </w:p>
-        </w:tc>
-        <w:tc>
-          <w:tcPr/>
-          <w:p>
-            <w:pPr>
-              <w:pStyle w:val="Compact"/>
-            </w:pPr>
-            <w:r>
-              <w:t xml:space="preserve">Files Affected</w:t>
-            </w:r>
-          </w:p>
-        </w:tc>
-      </w:tr>
-      <w:tr>
-        <w:tc>
-          <w:tcPr/>
-          <w:p>
-            <w:pPr>
-              <w:pStyle w:val="Compact"/>
-            </w:pPr>
-            <w:r>
-              <w:t xml:space="preserve">46</w:t>
-            </w:r>
-          </w:p>
-        </w:tc>
-        <w:tc>
-          <w:tcPr/>
-          <w:p>
-            <w:pPr>
-              <w:pStyle w:val="Compact"/>
-            </w:pPr>
-            <w:r>
-              <w:rPr>
-                <w:b/>
-                <w:bCs/>
-              </w:rPr>
-              <w:t xml:space="preserve">GitHub Actions CI pipeline</w:t>
-            </w:r>
-          </w:p>
-        </w:tc>
-        <w:tc>
-          <w:tcPr/>
-          <w:p>
-            <w:pPr>
-              <w:pStyle w:val="Compact"/>
-            </w:pPr>
-            <w:r>
-              <w:t xml:space="preserve">On push/PR: install deps →</w:t>
-            </w:r>
-            <w:r>
-              <w:t xml:space="preserve"> </w:t>
-            </w:r>
-            <w:r>
-              <w:rPr>
-                <w:rStyle w:val="VerbatimChar"/>
-              </w:rPr>
-              <w:t xml:space="preserve">pytest</w:t>
-            </w:r>
-            <w:r>
-              <w:t xml:space="preserve"> </w:t>
-            </w:r>
-            <w:r>
-              <w:t xml:space="preserve">with coverage →</w:t>
-            </w:r>
-            <w:r>
-              <w:t xml:space="preserve"> </w:t>
-            </w:r>
-            <w:r>
-              <w:rPr>
-                <w:rStyle w:val="VerbatimChar"/>
-              </w:rPr>
-              <w:t xml:space="preserve">ruff</w:t>
-            </w:r>
-            <w:r>
-              <w:t xml:space="preserve"> </w:t>
-            </w:r>
-            <w:r>
-              <w:t xml:space="preserve">linter → fail if coverage &lt;80%.</w:t>
-            </w:r>
-          </w:p>
-        </w:tc>
-        <w:tc>
-          <w:tcPr/>
-          <w:p>
-            <w:pPr>
-              <w:pStyle w:val="Compact"/>
-            </w:pPr>
-            <w:r>
-              <w:t xml:space="preserve">New:</w:t>
-            </w:r>
-            <w:r>
-              <w:t xml:space="preserve"> </w:t>
-            </w:r>
-            <w:r>
-              <w:rPr>
-                <w:rStyle w:val="VerbatimChar"/>
-              </w:rPr>
-              <w:t xml:space="preserve">.github/workflows/ci.yml</w:t>
-            </w:r>
-          </w:p>
-        </w:tc>
-      </w:tr>
-      <w:tr>
-        <w:tc>
-          <w:tcPr/>
-          <w:p>
-            <w:pPr>
-              <w:pStyle w:val="Compact"/>
-            </w:pPr>
-            <w:r>
-              <w:t xml:space="preserve">47</w:t>
-            </w:r>
-          </w:p>
-        </w:tc>
-        <w:tc>
-          <w:tcPr/>
-          <w:p>
-            <w:pPr>
-              <w:pStyle w:val="Compact"/>
-            </w:pPr>
-            <w:r>
-              <w:rPr>
-                <w:b/>
-                <w:bCs/>
-              </w:rPr>
-              <w:t xml:space="preserve">Frontend linting &amp; type-checking</w:t>
-            </w:r>
-          </w:p>
-        </w:tc>
-        <w:tc>
-          <w:tcPr/>
-          <w:p>
-            <w:pPr>
-              <w:pStyle w:val="Compact"/>
-            </w:pPr>
-            <w:r>
-              <w:t xml:space="preserve">Extend CI:</w:t>
-            </w:r>
-            <w:r>
-              <w:t xml:space="preserve"> </w:t>
-            </w:r>
-            <w:r>
-              <w:rPr>
-                <w:rStyle w:val="VerbatimChar"/>
-              </w:rPr>
-              <w:t xml:space="preserve">npx tsc --noEmit</w:t>
-            </w:r>
-            <w:r>
-              <w:t xml:space="preserve"> </w:t>
-            </w:r>
-            <w:r>
-              <w:t xml:space="preserve">+</w:t>
-            </w:r>
-            <w:r>
-              <w:t xml:space="preserve"> </w:t>
-            </w:r>
-            <w:r>
-              <w:rPr>
-                <w:rStyle w:val="VerbatimChar"/>
-              </w:rPr>
-              <w:t xml:space="preserve">npx eslint .</w:t>
-            </w:r>
-            <w:r>
-              <w:t xml:space="preserve">. Fail on errors.</w:t>
-            </w:r>
-          </w:p>
-        </w:tc>
-        <w:tc>
-          <w:tcPr/>
-          <w:p>
-            <w:pPr>
-              <w:pStyle w:val="Compact"/>
-            </w:pPr>
-            <w:r>
-              <w:rPr>
-                <w:rStyle w:val="VerbatimChar"/>
-              </w:rPr>
-              <w:t xml:space="preserve">.github/workflows/ci.yml</w:t>
-            </w:r>
-          </w:p>
-        </w:tc>
-      </w:tr>
-      <w:tr>
-        <w:tc>
-          <w:tcPr/>
-          <w:p>
-            <w:pPr>
-              <w:pStyle w:val="Compact"/>
-            </w:pPr>
-            <w:r>
-              <w:t xml:space="preserve">48</w:t>
-            </w:r>
-          </w:p>
-        </w:tc>
-        <w:tc>
-          <w:tcPr/>
-          <w:p>
-            <w:pPr>
-              <w:pStyle w:val="Compact"/>
-            </w:pPr>
-            <w:r>
-              <w:rPr>
-                <w:b/>
-                <w:bCs/>
-              </w:rPr>
-              <w:t xml:space="preserve">Docker image build &amp; push</w:t>
-            </w:r>
-          </w:p>
-        </w:tc>
-        <w:tc>
-          <w:tcPr/>
-          <w:p>
-            <w:pPr>
-              <w:pStyle w:val="Compact"/>
-            </w:pPr>
-            <w:r>
-              <w:t xml:space="preserve">On merge to</w:t>
-            </w:r>
-            <w:r>
-              <w:t xml:space="preserve"> </w:t>
-            </w:r>
-            <w:r>
-              <w:rPr>
-                <w:rStyle w:val="VerbatimChar"/>
-              </w:rPr>
-              <w:t xml:space="preserve">main</w:t>
-            </w:r>
-            <w:r>
-              <w:t xml:space="preserve">: build both images, tag with git SHA, push to</w:t>
-            </w:r>
-            <w:r>
-              <w:t xml:space="preserve"> </w:t>
-            </w:r>
-            <w:r>
-              <w:rPr>
-                <w:rStyle w:val="VerbatimChar"/>
-              </w:rPr>
-              <w:t xml:space="preserve">ghcr.io</w:t>
-            </w:r>
-            <w:r>
-              <w:t xml:space="preserve">.</w:t>
-            </w:r>
-          </w:p>
-        </w:tc>
-        <w:tc>
-          <w:tcPr/>
-          <w:p>
-            <w:pPr>
-              <w:pStyle w:val="Compact"/>
-            </w:pPr>
-            <w:r>
-              <w:rPr>
-                <w:rStyle w:val="VerbatimChar"/>
-              </w:rPr>
-              <w:t xml:space="preserve">.github/workflows/ci.yml</w:t>
-            </w:r>
-          </w:p>
-        </w:tc>
-      </w:tr>
-      <w:tr>
-        <w:tc>
-          <w:tcPr/>
-          <w:p>
-            <w:pPr>
-              <w:pStyle w:val="Compact"/>
-            </w:pPr>
-            <w:r>
-              <w:t xml:space="preserve">49</w:t>
-            </w:r>
-          </w:p>
-        </w:tc>
-        <w:tc>
-          <w:tcPr/>
-          <w:p>
-            <w:pPr>
-              <w:pStyle w:val="Compact"/>
-            </w:pPr>
-            <w:r>
-              <w:rPr>
-                <w:b/>
-                <w:bCs/>
-              </w:rPr>
-              <w:t xml:space="preserve">Kubernetes Helm chart</w:t>
-            </w:r>
-          </w:p>
-        </w:tc>
-        <w:tc>
-          <w:tcPr/>
-          <w:p>
-            <w:pPr>
-              <w:pStyle w:val="Compact"/>
-            </w:pPr>
-            <w:r>
-              <w:t xml:space="preserve">Templates: Deployment, Service, Ingress (TLS), ConfigMap, Secret, PVC.</w:t>
-            </w:r>
-          </w:p>
-        </w:tc>
-        <w:tc>
-          <w:tcPr/>
-          <w:p>
-            <w:pPr>
-              <w:pStyle w:val="Compact"/>
-            </w:pPr>
-            <w:r>
-              <w:t xml:space="preserve">New:</w:t>
-            </w:r>
-            <w:r>
-              <w:t xml:space="preserve"> </w:t>
-            </w:r>
-            <w:r>
-              <w:rPr>
-                <w:rStyle w:val="VerbatimChar"/>
-              </w:rPr>
-              <w:t xml:space="preserve">deploy/helm/semanticos/</w:t>
             </w:r>
           </w:p>
         </w:tc>
@@ -6459,40 +6459,40 @@
                 <w:b/>
                 <w:bCs/>
               </w:rPr>
-              <w:t xml:space="preserve">4. Auth &amp; RBAC</w:t>
-            </w:r>
-          </w:p>
-        </w:tc>
-        <w:tc>
-          <w:tcPr/>
-          <w:p>
-            <w:pPr>
-              <w:pStyle w:val="Compact"/>
-            </w:pPr>
-            <w:r>
-              <w:t xml:space="preserve">18–25</w:t>
-            </w:r>
-          </w:p>
-        </w:tc>
-        <w:tc>
-          <w:tcPr/>
-          <w:p>
-            <w:pPr>
-              <w:pStyle w:val="Compact"/>
-            </w:pPr>
-            <w:r>
-              <w:t xml:space="preserve">JWT login, roles, user management</w:t>
-            </w:r>
-          </w:p>
-        </w:tc>
-        <w:tc>
-          <w:tcPr/>
-          <w:p>
-            <w:pPr>
-              <w:pStyle w:val="Compact"/>
-            </w:pPr>
-            <w:r>
-              <w:t xml:space="preserve">5 days</w:t>
+              <w:t xml:space="preserve">4. Scale &amp; Storage</w:t>
+            </w:r>
+          </w:p>
+        </w:tc>
+        <w:tc>
+          <w:tcPr/>
+          <w:p>
+            <w:pPr>
+              <w:pStyle w:val="Compact"/>
+            </w:pPr>
+            <w:r>
+              <w:t xml:space="preserve">35–40</w:t>
+            </w:r>
+          </w:p>
+        </w:tc>
+        <w:tc>
+          <w:tcPr/>
+          <w:p>
+            <w:pPr>
+              <w:pStyle w:val="Compact"/>
+            </w:pPr>
+            <w:r>
+              <w:t xml:space="preserve">S3, LanceDB vectors, Redis/Celery, ClickHouse</w:t>
+            </w:r>
+          </w:p>
+        </w:tc>
+        <w:tc>
+          <w:tcPr/>
+          <w:p>
+            <w:pPr>
+              <w:pStyle w:val="Compact"/>
+            </w:pPr>
+            <w:r>
+              <w:t xml:space="preserve">6-11 days</w:t>
             </w:r>
           </w:p>
         </w:tc>
@@ -6509,40 +6509,40 @@
                 <w:b/>
                 <w:bCs/>
               </w:rPr>
-              <w:t xml:space="preserve">5. Alerting</w:t>
-            </w:r>
-          </w:p>
-        </w:tc>
-        <w:tc>
-          <w:tcPr/>
-          <w:p>
-            <w:pPr>
-              <w:pStyle w:val="Compact"/>
-            </w:pPr>
-            <w:r>
-              <w:t xml:space="preserve">26–30</w:t>
-            </w:r>
-          </w:p>
-        </w:tc>
-        <w:tc>
-          <w:tcPr/>
-          <w:p>
-            <w:pPr>
-              <w:pStyle w:val="Compact"/>
-            </w:pPr>
-            <w:r>
-              <w:t xml:space="preserve">Slack, Email, PagerDuty, alert history</w:t>
-            </w:r>
-          </w:p>
-        </w:tc>
-        <w:tc>
-          <w:tcPr/>
-          <w:p>
-            <w:pPr>
-              <w:pStyle w:val="Compact"/>
-            </w:pPr>
-            <w:r>
-              <w:t xml:space="preserve">3 days</w:t>
+              <w:t xml:space="preserve">5. Containerization</w:t>
+            </w:r>
+          </w:p>
+        </w:tc>
+        <w:tc>
+          <w:tcPr/>
+          <w:p>
+            <w:pPr>
+              <w:pStyle w:val="Compact"/>
+            </w:pPr>
+            <w:r>
+              <w:t xml:space="preserve">41–45</w:t>
+            </w:r>
+          </w:p>
+        </w:tc>
+        <w:tc>
+          <w:tcPr/>
+          <w:p>
+            <w:pPr>
+              <w:pStyle w:val="Compact"/>
+            </w:pPr>
+            <w:r>
+              <w:t xml:space="preserve">Docker, Nginx, Redis pub/sub</w:t>
+            </w:r>
+          </w:p>
+        </w:tc>
+        <w:tc>
+          <w:tcPr/>
+          <w:p>
+            <w:pPr>
+              <w:pStyle w:val="Compact"/>
+            </w:pPr>
+            <w:r>
+              <w:t xml:space="preserve">4 days</w:t>
             </w:r>
           </w:p>
         </w:tc>
@@ -6559,40 +6559,40 @@
                 <w:b/>
                 <w:bCs/>
               </w:rPr>
-              <w:t xml:space="preserve">6. Audit &amp; Compliance</w:t>
-            </w:r>
-          </w:p>
-        </w:tc>
-        <w:tc>
-          <w:tcPr/>
-          <w:p>
-            <w:pPr>
-              <w:pStyle w:val="Compact"/>
-            </w:pPr>
-            <w:r>
-              <w:t xml:space="preserve">31–34</w:t>
-            </w:r>
-          </w:p>
-        </w:tc>
-        <w:tc>
-          <w:tcPr/>
-          <w:p>
-            <w:pPr>
-              <w:pStyle w:val="Compact"/>
-            </w:pPr>
-            <w:r>
-              <w:t xml:space="preserve">Audit trail, SOC2 readiness, retention</w:t>
-            </w:r>
-          </w:p>
-        </w:tc>
-        <w:tc>
-          <w:tcPr/>
-          <w:p>
-            <w:pPr>
-              <w:pStyle w:val="Compact"/>
-            </w:pPr>
-            <w:r>
-              <w:t xml:space="preserve">3 days</w:t>
+              <w:t xml:space="preserve">6. Auth &amp; RBAC</w:t>
+            </w:r>
+          </w:p>
+        </w:tc>
+        <w:tc>
+          <w:tcPr/>
+          <w:p>
+            <w:pPr>
+              <w:pStyle w:val="Compact"/>
+            </w:pPr>
+            <w:r>
+              <w:t xml:space="preserve">18–25</w:t>
+            </w:r>
+          </w:p>
+        </w:tc>
+        <w:tc>
+          <w:tcPr/>
+          <w:p>
+            <w:pPr>
+              <w:pStyle w:val="Compact"/>
+            </w:pPr>
+            <w:r>
+              <w:t xml:space="preserve">JWT login, roles, user management</w:t>
+            </w:r>
+          </w:p>
+        </w:tc>
+        <w:tc>
+          <w:tcPr/>
+          <w:p>
+            <w:pPr>
+              <w:pStyle w:val="Compact"/>
+            </w:pPr>
+            <w:r>
+              <w:t xml:space="preserve">5 days</w:t>
             </w:r>
           </w:p>
         </w:tc>
@@ -6609,40 +6609,40 @@
                 <w:b/>
                 <w:bCs/>
               </w:rPr>
-              <w:t xml:space="preserve">7. Scale &amp; Storage</w:t>
-            </w:r>
-          </w:p>
-        </w:tc>
-        <w:tc>
-          <w:tcPr/>
-          <w:p>
-            <w:pPr>
-              <w:pStyle w:val="Compact"/>
-            </w:pPr>
-            <w:r>
-              <w:t xml:space="preserve">35–40</w:t>
-            </w:r>
-          </w:p>
-        </w:tc>
-        <w:tc>
-          <w:tcPr/>
-          <w:p>
-            <w:pPr>
-              <w:pStyle w:val="Compact"/>
-            </w:pPr>
-            <w:r>
-              <w:t xml:space="preserve">S3, LanceDB vectors, Redis/Celery, ClickHouse</w:t>
-            </w:r>
-          </w:p>
-        </w:tc>
-        <w:tc>
-          <w:tcPr/>
-          <w:p>
-            <w:pPr>
-              <w:pStyle w:val="Compact"/>
-            </w:pPr>
-            <w:r>
-              <w:t xml:space="preserve">6-11 days</w:t>
+              <w:t xml:space="preserve">7. Audit &amp; Compliance</w:t>
+            </w:r>
+          </w:p>
+        </w:tc>
+        <w:tc>
+          <w:tcPr/>
+          <w:p>
+            <w:pPr>
+              <w:pStyle w:val="Compact"/>
+            </w:pPr>
+            <w:r>
+              <w:t xml:space="preserve">31–34</w:t>
+            </w:r>
+          </w:p>
+        </w:tc>
+        <w:tc>
+          <w:tcPr/>
+          <w:p>
+            <w:pPr>
+              <w:pStyle w:val="Compact"/>
+            </w:pPr>
+            <w:r>
+              <w:t xml:space="preserve">Audit trail, SOC2 readiness, retention</w:t>
+            </w:r>
+          </w:p>
+        </w:tc>
+        <w:tc>
+          <w:tcPr/>
+          <w:p>
+            <w:pPr>
+              <w:pStyle w:val="Compact"/>
+            </w:pPr>
+            <w:r>
+              <w:t xml:space="preserve">3 days</w:t>
             </w:r>
           </w:p>
         </w:tc>
@@ -6659,40 +6659,40 @@
                 <w:b/>
                 <w:bCs/>
               </w:rPr>
-              <w:t xml:space="preserve">8. Containerization</w:t>
-            </w:r>
-          </w:p>
-        </w:tc>
-        <w:tc>
-          <w:tcPr/>
-          <w:p>
-            <w:pPr>
-              <w:pStyle w:val="Compact"/>
-            </w:pPr>
-            <w:r>
-              <w:t xml:space="preserve">41–45</w:t>
-            </w:r>
-          </w:p>
-        </w:tc>
-        <w:tc>
-          <w:tcPr/>
-          <w:p>
-            <w:pPr>
-              <w:pStyle w:val="Compact"/>
-            </w:pPr>
-            <w:r>
-              <w:t xml:space="preserve">Docker, Nginx, Redis pub/sub</w:t>
-            </w:r>
-          </w:p>
-        </w:tc>
-        <w:tc>
-          <w:tcPr/>
-          <w:p>
-            <w:pPr>
-              <w:pStyle w:val="Compact"/>
-            </w:pPr>
-            <w:r>
-              <w:t xml:space="preserve">4 days</w:t>
+              <w:t xml:space="preserve">8. CI/CD</w:t>
+            </w:r>
+          </w:p>
+        </w:tc>
+        <w:tc>
+          <w:tcPr/>
+          <w:p>
+            <w:pPr>
+              <w:pStyle w:val="Compact"/>
+            </w:pPr>
+            <w:r>
+              <w:t xml:space="preserve">46–49</w:t>
+            </w:r>
+          </w:p>
+        </w:tc>
+        <w:tc>
+          <w:tcPr/>
+          <w:p>
+            <w:pPr>
+              <w:pStyle w:val="Compact"/>
+            </w:pPr>
+            <w:r>
+              <w:t xml:space="preserve">GitHub Actions, Helm charts</w:t>
+            </w:r>
+          </w:p>
+        </w:tc>
+        <w:tc>
+          <w:tcPr/>
+          <w:p>
+            <w:pPr>
+              <w:pStyle w:val="Compact"/>
+            </w:pPr>
+            <w:r>
+              <w:t xml:space="preserve">3 days</w:t>
             </w:r>
           </w:p>
         </w:tc>
@@ -6709,29 +6709,29 @@
                 <w:b/>
                 <w:bCs/>
               </w:rPr>
-              <w:t xml:space="preserve">9. CI/CD</w:t>
-            </w:r>
-          </w:p>
-        </w:tc>
-        <w:tc>
-          <w:tcPr/>
-          <w:p>
-            <w:pPr>
-              <w:pStyle w:val="Compact"/>
-            </w:pPr>
-            <w:r>
-              <w:t xml:space="preserve">46–49</w:t>
-            </w:r>
-          </w:p>
-        </w:tc>
-        <w:tc>
-          <w:tcPr/>
-          <w:p>
-            <w:pPr>
-              <w:pStyle w:val="Compact"/>
-            </w:pPr>
-            <w:r>
-              <w:t xml:space="preserve">GitHub Actions, Helm charts</w:t>
+              <w:t xml:space="preserve">9. Alerting</w:t>
+            </w:r>
+          </w:p>
+        </w:tc>
+        <w:tc>
+          <w:tcPr/>
+          <w:p>
+            <w:pPr>
+              <w:pStyle w:val="Compact"/>
+            </w:pPr>
+            <w:r>
+              <w:t xml:space="preserve">26–30</w:t>
+            </w:r>
+          </w:p>
+        </w:tc>
+        <w:tc>
+          <w:tcPr/>
+          <w:p>
+            <w:pPr>
+              <w:pStyle w:val="Compact"/>
+            </w:pPr>
+            <w:r>
+              <w:t xml:space="preserve">Slack, Email, PagerDuty, alert history</w:t>
             </w:r>
           </w:p>
         </w:tc>
@@ -6918,7 +6918,7 @@
         <w:t xml:space="preserve"> </w:t>
       </w:r>
       <w:r>
-        <w:t xml:space="preserve">Phase 1 → Phase 2 → Phase 8 → Phase 4 → Phase 11 gives you a</w:t>
+        <w:t xml:space="preserve">Phase 1 → Phase 2 → Phase 3 → Phase 5 → Phase 6 → Phase 11 gives you a</w:t>
       </w:r>
       <w:r>
         <w:t xml:space="preserve"> </w:t>
@@ -6934,7 +6934,7 @@
         <w:t xml:space="preserve"> </w:t>
       </w:r>
       <w:r>
-        <w:t xml:space="preserve">in ~23 days.</w:t>
+        <w:t xml:space="preserve">in ~27 days.</w:t>
       </w:r>
     </w:p>
     <w:bookmarkEnd w:id="20"/>

</xml_diff>